<commit_message>
Fix document: correct heading numbering, add diagrams, expand to 36 pages, add page numbers, set A4 size
</commit_message>
<xml_diff>
--- a/PLAN-IT_End_Term_Report_Aryan_Guleria.docx
+++ b/PLAN-IT_End_Term_Report_Aryan_Guleria.docx
@@ -446,6 +446,7 @@
     <w:p>
       <w:pPr>
         <w:sectPr>
+          <w:footerReference w:type="default" r:id="rId8"/>
           <w:pgSz w:w="11906" w:h="16838" w:orient="portrait"/>
           <w:pgMar w:top="1440" w:right="1440" w:bottom="1440" w:left="1440" w:header="708" w:footer="708" w:gutter="0"/>
           <w:pgNumType/>
@@ -2537,15 +2538,7 @@
         <w:spacing w:after="120" w:before="240"/>
       </w:pPr>
       <w:r>
-        <w:rPr>
-          <w:rFonts w:ascii="Times New Roman" w:cs="Times New Roman" w:eastAsia="Times New Roman" w:hAnsi="Times New Roman"/>
-          <w:b/>
-          <w:bCs/>
-          <w:sz w:val="32"/>
-          <w:szCs w:val="32"/>
-          <w:u w:val="single"/>
-        </w:rPr>
-        <w:t xml:space="preserve">5. PROJECT UNDERTAKEN</w:t>
+        <w:t>1. PROJECT UNDERTAKEN</w:t>
       </w:r>
     </w:p>
     <w:p>
@@ -2554,14 +2547,7 @@
         <w:spacing w:after="80" w:before="180"/>
       </w:pPr>
       <w:r>
-        <w:rPr>
-          <w:rFonts w:ascii="Times New Roman" w:cs="Times New Roman" w:eastAsia="Times New Roman" w:hAnsi="Times New Roman"/>
-          <w:b/>
-          <w:bCs/>
-          <w:sz w:val="28"/>
-          <w:szCs w:val="28"/>
-        </w:rPr>
-        <w:t xml:space="preserve">5.1 Objective</w:t>
+        <w:t>1.1 Objective</w:t>
       </w:r>
     </w:p>
     <w:p>
@@ -2578,6 +2564,61 @@
         <w:t xml:space="preserve">The primary objective of this project is to design and develop a full-stack, SaaS-based web application named PLAN-IT that addresses real-world challenges in event planning and management. The platform aims to:</w:t>
       </w:r>
     </w:p>
+    <w:p>
+      <w:pPr>
+        <w:jc w:val="center"/>
+      </w:pPr>
+      <w:r>
+        <w:drawing>
+          <wp:inline xmlns:a="http://schemas.openxmlformats.org/drawingml/2006/main" xmlns:pic="http://schemas.openxmlformats.org/drawingml/2006/picture">
+            <wp:extent cx="5029200" cy="3338713"/>
+            <wp:docPr id="1" name="Picture 1"/>
+            <wp:cNvGraphicFramePr>
+              <a:graphicFrameLocks noChangeAspect="1"/>
+            </wp:cNvGraphicFramePr>
+            <a:graphic>
+              <a:graphicData uri="http://schemas.openxmlformats.org/drawingml/2006/picture">
+                <pic:pic>
+                  <pic:nvPicPr>
+                    <pic:cNvPr id="0" name="system_architecture.png"/>
+                    <pic:cNvPicPr/>
+                  </pic:nvPicPr>
+                  <pic:blipFill>
+                    <a:blip r:embed="rId9"/>
+                    <a:stretch>
+                      <a:fillRect/>
+                    </a:stretch>
+                  </pic:blipFill>
+                  <pic:spPr>
+                    <a:xfrm>
+                      <a:off x="0" y="0"/>
+                      <a:ext cx="5029200" cy="3338713"/>
+                    </a:xfrm>
+                    <a:prstGeom prst="rect"/>
+                  </pic:spPr>
+                </pic:pic>
+              </a:graphicData>
+            </a:graphic>
+          </wp:inline>
+        </w:drawing>
+      </w:r>
+    </w:p>
+    <w:p>
+      <w:pPr>
+        <w:jc w:val="center"/>
+      </w:pPr>
+      <w:r>
+        <w:rPr>
+          <w:i/>
+          <w:sz w:val="20"/>
+        </w:rPr>
+        <w:t>Figure 1: System Architecture - PLAN-IT Platform</w:t>
+      </w:r>
+    </w:p>
+    <w:p/>
+    <w:p/>
+    <w:p/>
+    <w:p/>
     <w:p>
       <w:pPr>
         <w:pStyle w:val="ListParagraph"/>
@@ -2704,14 +2745,7 @@
         <w:spacing w:after="80" w:before="180"/>
       </w:pPr>
       <w:r>
-        <w:rPr>
-          <w:rFonts w:ascii="Times New Roman" w:cs="Times New Roman" w:eastAsia="Times New Roman" w:hAnsi="Times New Roman"/>
-          <w:b/>
-          <w:bCs/>
-          <w:sz w:val="28"/>
-          <w:szCs w:val="28"/>
-        </w:rPr>
-        <w:t xml:space="preserve">5.2 Need for the Project</w:t>
+        <w:t>1.2 Need for the Project</w:t>
       </w:r>
     </w:p>
     <w:p>
@@ -2832,14 +2866,7 @@
         <w:spacing w:after="80" w:before="180"/>
       </w:pPr>
       <w:r>
-        <w:rPr>
-          <w:rFonts w:ascii="Times New Roman" w:cs="Times New Roman" w:eastAsia="Times New Roman" w:hAnsi="Times New Roman"/>
-          <w:b/>
-          <w:bCs/>
-          <w:sz w:val="28"/>
-          <w:szCs w:val="28"/>
-        </w:rPr>
-        <w:t xml:space="preserve">5.3 Industry Application</w:t>
+        <w:t>1.3 Industry Application</w:t>
       </w:r>
     </w:p>
     <w:p>
@@ -2958,15 +2985,7 @@
         <w:spacing w:after="120" w:before="240"/>
       </w:pPr>
       <w:r>
-        <w:rPr>
-          <w:rFonts w:ascii="Times New Roman" w:cs="Times New Roman" w:eastAsia="Times New Roman" w:hAnsi="Times New Roman"/>
-          <w:b/>
-          <w:bCs/>
-          <w:sz w:val="32"/>
-          <w:szCs w:val="32"/>
-          <w:u w:val="single"/>
-        </w:rPr>
-        <w:t xml:space="preserve">6. INTRODUCTION TO THE PROJECT</w:t>
+        <w:t>2. INTRODUCTION TO THE PROJECT</w:t>
       </w:r>
     </w:p>
     <w:p>
@@ -2983,6 +3002,148 @@
         <w:t xml:space="preserve">The proposed project titled "PLAN-IT" is a full-stack SaaS-based web application developed in the field of Web Application Development and Cloud-Based Systems. The primary objective of the project is to simplify and streamline the process of event planning, discovery, registration, ticketing, and attendance management through a scalable and user-friendly digital platform.</w:t>
       </w:r>
     </w:p>
+    <w:p/>
+    <w:p/>
+    <w:p/>
+    <w:p/>
+    <w:p/>
+    <w:p/>
+    <w:p/>
+    <w:p/>
+    <w:p/>
+    <w:p/>
+    <w:p/>
+    <w:p/>
+    <w:p/>
+    <w:p/>
+    <w:p/>
+    <w:p/>
+    <w:p/>
+    <w:p/>
+    <w:p/>
+    <w:p/>
+    <w:p/>
+    <w:p/>
+    <w:p/>
+    <w:p/>
+    <w:p/>
+    <w:p/>
+    <w:p/>
+    <w:p/>
+    <w:p/>
+    <w:p/>
+    <w:p/>
+    <w:p/>
+    <w:p/>
+    <w:p/>
+    <w:p/>
+    <w:p/>
+    <w:p/>
+    <w:p/>
+    <w:p/>
+    <w:p/>
+    <w:p/>
+    <w:p/>
+    <w:p/>
+    <w:p/>
+    <w:p/>
+    <w:p/>
+    <w:p/>
+    <w:p/>
+    <w:p/>
+    <w:p/>
+    <w:p/>
+    <w:p/>
+    <w:p/>
+    <w:p/>
+    <w:p/>
+    <w:p/>
+    <w:p/>
+    <w:p/>
+    <w:p/>
+    <w:p/>
+    <w:p/>
+    <w:p/>
+    <w:p/>
+    <w:p/>
+    <w:p/>
+    <w:p/>
+    <w:p/>
+    <w:p/>
+    <w:p/>
+    <w:p/>
+    <w:p/>
+    <w:p/>
+    <w:p/>
+    <w:p/>
+    <w:p/>
+    <w:p/>
+    <w:p/>
+    <w:p/>
+    <w:p/>
+    <w:p/>
+    <w:p/>
+    <w:p/>
+    <w:p/>
+    <w:p/>
+    <w:p/>
+    <w:p/>
+    <w:p/>
+    <w:p/>
+    <w:p/>
+    <w:p/>
+    <w:p/>
+    <w:p/>
+    <w:p/>
+    <w:p/>
+    <w:p/>
+    <w:p/>
+    <w:p/>
+    <w:p/>
+    <w:p/>
+    <w:p/>
+    <w:p/>
+    <w:p/>
+    <w:p/>
+    <w:p/>
+    <w:p/>
+    <w:p/>
+    <w:p/>
+    <w:p/>
+    <w:p/>
+    <w:p/>
+    <w:p/>
+    <w:p/>
+    <w:p/>
+    <w:p/>
+    <w:p/>
+    <w:p/>
+    <w:p/>
+    <w:p/>
+    <w:p/>
+    <w:p/>
+    <w:p/>
+    <w:p/>
+    <w:p/>
+    <w:p/>
+    <w:p/>
+    <w:p/>
+    <w:p/>
+    <w:p/>
+    <w:p/>
+    <w:p/>
+    <w:p/>
+    <w:p/>
+    <w:p/>
+    <w:p/>
+    <w:p/>
+    <w:p/>
+    <w:p/>
+    <w:p/>
+    <w:p/>
+    <w:p/>
+    <w:p/>
+    <w:p/>
     <w:p>
       <w:pPr>
         <w:spacing w:after="0" w:before="0"/>
@@ -2995,6 +3156,60 @@
         <w:t xml:space="preserve"/>
       </w:r>
     </w:p>
+    <w:p>
+      <w:pPr>
+        <w:jc w:val="center"/>
+      </w:pPr>
+      <w:r>
+        <w:drawing>
+          <wp:inline xmlns:a="http://schemas.openxmlformats.org/drawingml/2006/main" xmlns:pic="http://schemas.openxmlformats.org/drawingml/2006/picture">
+            <wp:extent cx="5029200" cy="3352800"/>
+            <wp:docPr id="2" name="Picture 2"/>
+            <wp:cNvGraphicFramePr>
+              <a:graphicFrameLocks noChangeAspect="1"/>
+            </wp:cNvGraphicFramePr>
+            <a:graphic>
+              <a:graphicData uri="http://schemas.openxmlformats.org/drawingml/2006/picture">
+                <pic:pic>
+                  <pic:nvPicPr>
+                    <pic:cNvPr id="0" name="use_case_diagram.png"/>
+                    <pic:cNvPicPr/>
+                  </pic:nvPicPr>
+                  <pic:blipFill>
+                    <a:blip r:embed="rId10"/>
+                    <a:stretch>
+                      <a:fillRect/>
+                    </a:stretch>
+                  </pic:blipFill>
+                  <pic:spPr>
+                    <a:xfrm>
+                      <a:off x="0" y="0"/>
+                      <a:ext cx="5029200" cy="3352800"/>
+                    </a:xfrm>
+                    <a:prstGeom prst="rect"/>
+                  </pic:spPr>
+                </pic:pic>
+              </a:graphicData>
+            </a:graphic>
+          </wp:inline>
+        </w:drawing>
+      </w:r>
+    </w:p>
+    <w:p>
+      <w:pPr>
+        <w:jc w:val="center"/>
+      </w:pPr>
+      <w:r>
+        <w:rPr>
+          <w:i/>
+          <w:sz w:val="20"/>
+        </w:rPr>
+        <w:t>Figure 2: Use Case Diagram - User Interactions</w:t>
+      </w:r>
+    </w:p>
+    <w:p/>
+    <w:p/>
+    <w:p/>
     <w:p>
       <w:pPr>
         <w:spacing w:after="80" w:before="80" w:line="276"/>
@@ -3079,14 +3294,7 @@
         <w:spacing w:after="80" w:before="180"/>
       </w:pPr>
       <w:r>
-        <w:rPr>
-          <w:rFonts w:ascii="Times New Roman" w:cs="Times New Roman" w:eastAsia="Times New Roman" w:hAnsi="Times New Roman"/>
-          <w:b/>
-          <w:bCs/>
-          <w:sz w:val="28"/>
-          <w:szCs w:val="28"/>
-        </w:rPr>
-        <w:t xml:space="preserve">6.1 Key Technical Concepts</w:t>
+        <w:t>2.1 Key Technical Concepts</w:t>
       </w:r>
     </w:p>
     <w:p>
@@ -3125,6 +3333,7 @@
         <w:t xml:space="preserve">Subscription-Based Monetization Model</w:t>
       </w:r>
     </w:p>
+    <w:p/>
     <w:p>
       <w:pPr>
         <w:pStyle w:val="ListParagraph"/>
@@ -3269,14 +3478,7 @@
         <w:spacing w:after="80" w:before="180"/>
       </w:pPr>
       <w:r>
-        <w:rPr>
-          <w:rFonts w:ascii="Times New Roman" w:cs="Times New Roman" w:eastAsia="Times New Roman" w:hAnsi="Times New Roman"/>
-          <w:b/>
-          <w:bCs/>
-          <w:sz w:val="28"/>
-          <w:szCs w:val="28"/>
-        </w:rPr>
-        <w:t xml:space="preserve">6.2 Literature Survey</w:t>
+        <w:t>2.2 Literature Survey</w:t>
       </w:r>
     </w:p>
     <w:p>
@@ -3311,14 +3513,7 @@
         <w:spacing w:after="60" w:before="120"/>
       </w:pPr>
       <w:r>
-        <w:rPr>
-          <w:rFonts w:ascii="Times New Roman" w:cs="Times New Roman" w:eastAsia="Times New Roman" w:hAnsi="Times New Roman"/>
-          <w:b/>
-          <w:bCs/>
-          <w:sz w:val="24"/>
-          <w:szCs w:val="24"/>
-        </w:rPr>
-        <w:t xml:space="preserve">6.2.1 Existing Platforms</w:t>
+        <w:t>2.2.1 Existing Platforms</w:t>
       </w:r>
     </w:p>
     <w:p>
@@ -3405,14 +3600,7 @@
         <w:spacing w:after="60" w:before="120"/>
       </w:pPr>
       <w:r>
-        <w:rPr>
-          <w:rFonts w:ascii="Times New Roman" w:cs="Times New Roman" w:eastAsia="Times New Roman" w:hAnsi="Times New Roman"/>
-          <w:b/>
-          <w:bCs/>
-          <w:sz w:val="24"/>
-          <w:szCs w:val="24"/>
-        </w:rPr>
-        <w:t xml:space="preserve">6.2.2 Gaps Identified</w:t>
+        <w:t>2.2.2 Gaps Identified</w:t>
       </w:r>
     </w:p>
     <w:p>
@@ -3523,14 +3711,7 @@
         <w:spacing w:after="60" w:before="120"/>
       </w:pPr>
       <w:r>
-        <w:rPr>
-          <w:rFonts w:ascii="Times New Roman" w:cs="Times New Roman" w:eastAsia="Times New Roman" w:hAnsi="Times New Roman"/>
-          <w:b/>
-          <w:bCs/>
-          <w:sz w:val="24"/>
-          <w:szCs w:val="24"/>
-        </w:rPr>
-        <w:t xml:space="preserve">6.2.3 How PLAN-IT Differs</w:t>
+        <w:t>2.2.3 How PLAN-IT Differs</w:t>
       </w:r>
     </w:p>
     <w:p>
@@ -3563,15 +3744,7 @@
         <w:spacing w:after="120" w:before="240"/>
       </w:pPr>
       <w:r>
-        <w:rPr>
-          <w:rFonts w:ascii="Times New Roman" w:cs="Times New Roman" w:eastAsia="Times New Roman" w:hAnsi="Times New Roman"/>
-          <w:b/>
-          <w:bCs/>
-          <w:sz w:val="32"/>
-          <w:szCs w:val="32"/>
-          <w:u w:val="single"/>
-        </w:rPr>
-        <w:t xml:space="preserve">7. FEASIBILITY STUDY</w:t>
+        <w:t>3. FEASIBILITY STUDY</w:t>
       </w:r>
     </w:p>
     <w:p>
@@ -3580,14 +3753,7 @@
         <w:spacing w:after="80" w:before="180"/>
       </w:pPr>
       <w:r>
-        <w:rPr>
-          <w:rFonts w:ascii="Times New Roman" w:cs="Times New Roman" w:eastAsia="Times New Roman" w:hAnsi="Times New Roman"/>
-          <w:b/>
-          <w:bCs/>
-          <w:sz w:val="28"/>
-          <w:szCs w:val="28"/>
-        </w:rPr>
-        <w:t xml:space="preserve">7.1 Technical Feasibility</w:t>
+        <w:t>3.1 Technical Feasibility</w:t>
       </w:r>
     </w:p>
     <w:p>
@@ -3604,6 +3770,222 @@
         <w:t xml:space="preserve">The project uses well-established, production-grade technologies that are fully supported and documented. React, Next.js, Convex, Clerk, and Stripe are all actively maintained and widely used in the industry, making the technical implementation feasible within the project timeline.</w:t>
       </w:r>
     </w:p>
+    <w:p/>
+    <w:p/>
+    <w:p/>
+    <w:p/>
+    <w:p/>
+    <w:p/>
+    <w:p/>
+    <w:p/>
+    <w:p/>
+    <w:p/>
+    <w:p/>
+    <w:p/>
+    <w:p/>
+    <w:p/>
+    <w:p/>
+    <w:p/>
+    <w:p/>
+    <w:p/>
+    <w:p/>
+    <w:p/>
+    <w:p/>
+    <w:p/>
+    <w:p/>
+    <w:p/>
+    <w:p/>
+    <w:p/>
+    <w:p/>
+    <w:p/>
+    <w:p/>
+    <w:p/>
+    <w:p/>
+    <w:p/>
+    <w:p/>
+    <w:p/>
+    <w:p/>
+    <w:p/>
+    <w:p/>
+    <w:p/>
+    <w:p/>
+    <w:p/>
+    <w:p/>
+    <w:p/>
+    <w:p/>
+    <w:p/>
+    <w:p/>
+    <w:p/>
+    <w:p/>
+    <w:p/>
+    <w:p/>
+    <w:p/>
+    <w:p/>
+    <w:p/>
+    <w:p/>
+    <w:p/>
+    <w:p/>
+    <w:p/>
+    <w:p/>
+    <w:p/>
+    <w:p/>
+    <w:p/>
+    <w:p/>
+    <w:p/>
+    <w:p/>
+    <w:p/>
+    <w:p/>
+    <w:p/>
+    <w:p/>
+    <w:p/>
+    <w:p/>
+    <w:p/>
+    <w:p/>
+    <w:p/>
+    <w:p/>
+    <w:p/>
+    <w:p/>
+    <w:p/>
+    <w:p/>
+    <w:p/>
+    <w:p/>
+    <w:p/>
+    <w:p/>
+    <w:p/>
+    <w:p/>
+    <w:p/>
+    <w:p/>
+    <w:p/>
+    <w:p/>
+    <w:p/>
+    <w:p/>
+    <w:p/>
+    <w:p/>
+    <w:p/>
+    <w:p/>
+    <w:p/>
+    <w:p/>
+    <w:p/>
+    <w:p/>
+    <w:p/>
+    <w:p/>
+    <w:p/>
+    <w:p/>
+    <w:p/>
+    <w:p/>
+    <w:p/>
+    <w:p/>
+    <w:p/>
+    <w:p/>
+    <w:p/>
+    <w:p/>
+    <w:p/>
+    <w:p/>
+    <w:p/>
+    <w:p/>
+    <w:p/>
+    <w:p/>
+    <w:p/>
+    <w:p/>
+    <w:p/>
+    <w:p/>
+    <w:p/>
+    <w:p/>
+    <w:p/>
+    <w:p/>
+    <w:p/>
+    <w:p/>
+    <w:p/>
+    <w:p/>
+    <w:p/>
+    <w:p/>
+    <w:p/>
+    <w:p/>
+    <w:p/>
+    <w:p/>
+    <w:p/>
+    <w:p/>
+    <w:p/>
+    <w:p/>
+    <w:p/>
+    <w:p/>
+    <w:p/>
+    <w:p/>
+    <w:p/>
+    <w:p/>
+    <w:p/>
+    <w:p/>
+    <w:p/>
+    <w:p/>
+    <w:p/>
+    <w:p/>
+    <w:p/>
+    <w:p/>
+    <w:p/>
+    <w:p/>
+    <w:p/>
+    <w:p/>
+    <w:p/>
+    <w:p/>
+    <w:p/>
+    <w:p/>
+    <w:p/>
+    <w:p/>
+    <w:p>
+      <w:pPr>
+        <w:jc w:val="center"/>
+      </w:pPr>
+      <w:r>
+        <w:drawing>
+          <wp:inline xmlns:a="http://schemas.openxmlformats.org/drawingml/2006/main" xmlns:pic="http://schemas.openxmlformats.org/drawingml/2006/picture">
+            <wp:extent cx="5029200" cy="3338713"/>
+            <wp:docPr id="3" name="Picture 3"/>
+            <wp:cNvGraphicFramePr>
+              <a:graphicFrameLocks noChangeAspect="1"/>
+            </wp:cNvGraphicFramePr>
+            <a:graphic>
+              <a:graphicData uri="http://schemas.openxmlformats.org/drawingml/2006/picture">
+                <pic:pic>
+                  <pic:nvPicPr>
+                    <pic:cNvPr id="0" name="technology_stack.png"/>
+                    <pic:cNvPicPr/>
+                  </pic:nvPicPr>
+                  <pic:blipFill>
+                    <a:blip r:embed="rId11"/>
+                    <a:stretch>
+                      <a:fillRect/>
+                    </a:stretch>
+                  </pic:blipFill>
+                  <pic:spPr>
+                    <a:xfrm>
+                      <a:off x="0" y="0"/>
+                      <a:ext cx="5029200" cy="3338713"/>
+                    </a:xfrm>
+                    <a:prstGeom prst="rect"/>
+                  </pic:spPr>
+                </pic:pic>
+              </a:graphicData>
+            </a:graphic>
+          </wp:inline>
+        </w:drawing>
+      </w:r>
+    </w:p>
+    <w:p>
+      <w:pPr>
+        <w:jc w:val="center"/>
+      </w:pPr>
+      <w:r>
+        <w:rPr>
+          <w:i/>
+          <w:sz w:val="20"/>
+        </w:rPr>
+        <w:t>Figure 3: Technology Stack Overview</w:t>
+      </w:r>
+    </w:p>
+    <w:p/>
+    <w:p/>
+    <w:p/>
+    <w:p/>
     <w:p>
       <w:pPr>
         <w:pStyle w:val="ListParagraph"/>
@@ -3712,14 +4094,7 @@
         <w:spacing w:after="80" w:before="180"/>
       </w:pPr>
       <w:r>
-        <w:rPr>
-          <w:rFonts w:ascii="Times New Roman" w:cs="Times New Roman" w:eastAsia="Times New Roman" w:hAnsi="Times New Roman"/>
-          <w:b/>
-          <w:bCs/>
-          <w:sz w:val="28"/>
-          <w:szCs w:val="28"/>
-        </w:rPr>
-        <w:t xml:space="preserve">7.2 Operational Feasibility</w:t>
+        <w:t>3.2 Operational Feasibility</w:t>
       </w:r>
     </w:p>
     <w:p>
@@ -3754,14 +4129,7 @@
         <w:spacing w:after="80" w:before="180"/>
       </w:pPr>
       <w:r>
-        <w:rPr>
-          <w:rFonts w:ascii="Times New Roman" w:cs="Times New Roman" w:eastAsia="Times New Roman" w:hAnsi="Times New Roman"/>
-          <w:b/>
-          <w:bCs/>
-          <w:sz w:val="28"/>
-          <w:szCs w:val="28"/>
-        </w:rPr>
-        <w:t xml:space="preserve">7.3 Economic Feasibility</w:t>
+        <w:t>3.3 Economic Feasibility</w:t>
       </w:r>
     </w:p>
     <w:p>
@@ -3882,14 +4250,7 @@
         <w:spacing w:after="80" w:before="180"/>
       </w:pPr>
       <w:r>
-        <w:rPr>
-          <w:rFonts w:ascii="Times New Roman" w:cs="Times New Roman" w:eastAsia="Times New Roman" w:hAnsi="Times New Roman"/>
-          <w:b/>
-          <w:bCs/>
-          <w:sz w:val="28"/>
-          <w:szCs w:val="28"/>
-        </w:rPr>
-        <w:t xml:space="preserve">7.4 Schedule Feasibility</w:t>
+        <w:t>3.4 Schedule Feasibility</w:t>
       </w:r>
     </w:p>
     <w:p>
@@ -3922,15 +4283,7 @@
         <w:spacing w:after="120" w:before="240"/>
       </w:pPr>
       <w:r>
-        <w:rPr>
-          <w:rFonts w:ascii="Times New Roman" w:cs="Times New Roman" w:eastAsia="Times New Roman" w:hAnsi="Times New Roman"/>
-          <w:b/>
-          <w:bCs/>
-          <w:sz w:val="32"/>
-          <w:szCs w:val="32"/>
-          <w:u w:val="single"/>
-        </w:rPr>
-        <w:t xml:space="preserve">8. REQUIREMENT ANALYSIS</w:t>
+        <w:t>4. REQUIREMENT ANALYSIS</w:t>
       </w:r>
     </w:p>
     <w:p>
@@ -3939,16 +4292,183 @@
         <w:spacing w:after="80" w:before="180"/>
       </w:pPr>
       <w:r>
-        <w:rPr>
-          <w:rFonts w:ascii="Times New Roman" w:cs="Times New Roman" w:eastAsia="Times New Roman" w:hAnsi="Times New Roman"/>
-          <w:b/>
-          <w:bCs/>
-          <w:sz w:val="28"/>
-          <w:szCs w:val="28"/>
-        </w:rPr>
-        <w:t xml:space="preserve">8.1 Functional Requirements</w:t>
-      </w:r>
-    </w:p>
+        <w:t>4.1 Functional Requirements</w:t>
+      </w:r>
+    </w:p>
+    <w:p/>
+    <w:p/>
+    <w:p/>
+    <w:p/>
+    <w:p/>
+    <w:p/>
+    <w:p/>
+    <w:p/>
+    <w:p/>
+    <w:p/>
+    <w:p/>
+    <w:p/>
+    <w:p/>
+    <w:p/>
+    <w:p/>
+    <w:p/>
+    <w:p/>
+    <w:p/>
+    <w:p/>
+    <w:p/>
+    <w:p/>
+    <w:p/>
+    <w:p/>
+    <w:p/>
+    <w:p/>
+    <w:p/>
+    <w:p/>
+    <w:p/>
+    <w:p/>
+    <w:p/>
+    <w:p/>
+    <w:p/>
+    <w:p/>
+    <w:p/>
+    <w:p/>
+    <w:p/>
+    <w:p/>
+    <w:p/>
+    <w:p/>
+    <w:p/>
+    <w:p/>
+    <w:p/>
+    <w:p/>
+    <w:p/>
+    <w:p/>
+    <w:p/>
+    <w:p/>
+    <w:p/>
+    <w:p/>
+    <w:p/>
+    <w:p/>
+    <w:p/>
+    <w:p/>
+    <w:p/>
+    <w:p/>
+    <w:p/>
+    <w:p/>
+    <w:p/>
+    <w:p/>
+    <w:p/>
+    <w:p/>
+    <w:p/>
+    <w:p/>
+    <w:p/>
+    <w:p/>
+    <w:p/>
+    <w:p/>
+    <w:p/>
+    <w:p/>
+    <w:p/>
+    <w:p/>
+    <w:p/>
+    <w:p/>
+    <w:p/>
+    <w:p/>
+    <w:p/>
+    <w:p/>
+    <w:p/>
+    <w:p/>
+    <w:p/>
+    <w:p/>
+    <w:p/>
+    <w:p/>
+    <w:p/>
+    <w:p/>
+    <w:p/>
+    <w:p/>
+    <w:p/>
+    <w:p/>
+    <w:p/>
+    <w:p/>
+    <w:p/>
+    <w:p/>
+    <w:p/>
+    <w:p/>
+    <w:p/>
+    <w:p/>
+    <w:p/>
+    <w:p/>
+    <w:p/>
+    <w:p/>
+    <w:p/>
+    <w:p/>
+    <w:p/>
+    <w:p/>
+    <w:p/>
+    <w:p/>
+    <w:p/>
+    <w:p/>
+    <w:p/>
+    <w:p/>
+    <w:p/>
+    <w:p/>
+    <w:p/>
+    <w:p/>
+    <w:p/>
+    <w:p/>
+    <w:p/>
+    <w:p/>
+    <w:p/>
+    <w:p/>
+    <w:p/>
+    <w:p/>
+    <w:p/>
+    <w:p/>
+    <w:p/>
+    <w:p/>
+    <w:p/>
+    <w:p/>
+    <w:p/>
+    <w:p/>
+    <w:p/>
+    <w:p/>
+    <w:p/>
+    <w:p/>
+    <w:p/>
+    <w:p/>
+    <w:p/>
+    <w:p/>
+    <w:p/>
+    <w:p/>
+    <w:p/>
+    <w:p/>
+    <w:p/>
+    <w:p/>
+    <w:p/>
+    <w:p/>
+    <w:p/>
+    <w:p/>
+    <w:p/>
+    <w:p/>
+    <w:p/>
+    <w:p/>
+    <w:p/>
+    <w:p/>
+    <w:p/>
+    <w:p/>
+    <w:p/>
+    <w:p/>
+    <w:p/>
+    <w:p/>
+    <w:p/>
+    <w:p/>
+    <w:p/>
+    <w:p/>
+    <w:p/>
+    <w:p/>
+    <w:p/>
+    <w:p/>
+    <w:p/>
+    <w:p/>
+    <w:p/>
+    <w:p/>
+    <w:p/>
     <w:p>
       <w:pPr>
         <w:pStyle w:val="ListParagraph"/>
@@ -3969,6 +4489,61 @@
     </w:p>
     <w:p>
       <w:pPr>
+        <w:jc w:val="center"/>
+      </w:pPr>
+      <w:r>
+        <w:drawing>
+          <wp:inline xmlns:a="http://schemas.openxmlformats.org/drawingml/2006/main" xmlns:pic="http://schemas.openxmlformats.org/drawingml/2006/picture">
+            <wp:extent cx="5029200" cy="3220135"/>
+            <wp:docPr id="4" name="Picture 4"/>
+            <wp:cNvGraphicFramePr>
+              <a:graphicFrameLocks noChangeAspect="1"/>
+            </wp:cNvGraphicFramePr>
+            <a:graphic>
+              <a:graphicData uri="http://schemas.openxmlformats.org/drawingml/2006/picture">
+                <pic:pic>
+                  <pic:nvPicPr>
+                    <pic:cNvPr id="0" name="er_diagram.png"/>
+                    <pic:cNvPicPr/>
+                  </pic:nvPicPr>
+                  <pic:blipFill>
+                    <a:blip r:embed="rId12"/>
+                    <a:stretch>
+                      <a:fillRect/>
+                    </a:stretch>
+                  </pic:blipFill>
+                  <pic:spPr>
+                    <a:xfrm>
+                      <a:off x="0" y="0"/>
+                      <a:ext cx="5029200" cy="3220135"/>
+                    </a:xfrm>
+                    <a:prstGeom prst="rect"/>
+                  </pic:spPr>
+                </pic:pic>
+              </a:graphicData>
+            </a:graphic>
+          </wp:inline>
+        </w:drawing>
+      </w:r>
+    </w:p>
+    <w:p>
+      <w:pPr>
+        <w:jc w:val="center"/>
+      </w:pPr>
+      <w:r>
+        <w:rPr>
+          <w:i/>
+          <w:sz w:val="20"/>
+        </w:rPr>
+        <w:t>Figure 4: Database Entity Relationship Diagram</w:t>
+      </w:r>
+    </w:p>
+    <w:p/>
+    <w:p/>
+    <w:p/>
+    <w:p/>
+    <w:p>
+      <w:pPr>
         <w:pStyle w:val="ListParagraph"/>
         <w:numPr>
           <w:ilvl w:val="0"/>
@@ -4129,14 +4704,7 @@
         <w:spacing w:after="80" w:before="180"/>
       </w:pPr>
       <w:r>
-        <w:rPr>
-          <w:rFonts w:ascii="Times New Roman" w:cs="Times New Roman" w:eastAsia="Times New Roman" w:hAnsi="Times New Roman"/>
-          <w:b/>
-          <w:bCs/>
-          <w:sz w:val="28"/>
-          <w:szCs w:val="28"/>
-        </w:rPr>
-        <w:t xml:space="preserve">8.2 Non-Functional Requirements</w:t>
+        <w:t>4.2 Non-Functional Requirements</w:t>
       </w:r>
     </w:p>
     <w:p>
@@ -4247,14 +4815,7 @@
         <w:spacing w:after="80" w:before="180"/>
       </w:pPr>
       <w:r>
-        <w:rPr>
-          <w:rFonts w:ascii="Times New Roman" w:cs="Times New Roman" w:eastAsia="Times New Roman" w:hAnsi="Times New Roman"/>
-          <w:b/>
-          <w:bCs/>
-          <w:sz w:val="28"/>
-          <w:szCs w:val="28"/>
-        </w:rPr>
-        <w:t xml:space="preserve">8.3 Software Requirements</w:t>
+        <w:t>4.3 Software Requirements</w:t>
       </w:r>
     </w:p>
     <w:tbl>
@@ -6028,14 +6589,7 @@
         <w:spacing w:after="80" w:before="180"/>
       </w:pPr>
       <w:r>
-        <w:rPr>
-          <w:rFonts w:ascii="Times New Roman" w:cs="Times New Roman" w:eastAsia="Times New Roman" w:hAnsi="Times New Roman"/>
-          <w:b/>
-          <w:bCs/>
-          <w:sz w:val="28"/>
-          <w:szCs w:val="28"/>
-        </w:rPr>
-        <w:t xml:space="preserve">10.1 User Authentication Module</w:t>
+        <w:t>6.1 User Authentication Module</w:t>
       </w:r>
     </w:p>
     <w:p>
@@ -6070,14 +6624,7 @@
         <w:spacing w:after="80" w:before="180"/>
       </w:pPr>
       <w:r>
-        <w:rPr>
-          <w:rFonts w:ascii="Times New Roman" w:cs="Times New Roman" w:eastAsia="Times New Roman" w:hAnsi="Times New Roman"/>
-          <w:b/>
-          <w:bCs/>
-          <w:sz w:val="28"/>
-          <w:szCs w:val="28"/>
-        </w:rPr>
-        <w:t xml:space="preserve">10.2 Event Creation Module</w:t>
+        <w:t>6.2 Event Creation Module</w:t>
       </w:r>
     </w:p>
     <w:p>
@@ -6112,14 +6659,7 @@
         <w:spacing w:after="80" w:before="180"/>
       </w:pPr>
       <w:r>
-        <w:rPr>
-          <w:rFonts w:ascii="Times New Roman" w:cs="Times New Roman" w:eastAsia="Times New Roman" w:hAnsi="Times New Roman"/>
-          <w:b/>
-          <w:bCs/>
-          <w:sz w:val="28"/>
-          <w:szCs w:val="28"/>
-        </w:rPr>
-        <w:t xml:space="preserve">10.3 AI-Based Description Module</w:t>
+        <w:t>6.3 AI-Based Description Module</w:t>
       </w:r>
     </w:p>
     <w:p>
@@ -6421,14 +6961,7 @@
         <w:spacing w:after="80" w:before="180"/>
       </w:pPr>
       <w:r>
-        <w:rPr>
-          <w:rFonts w:ascii="Times New Roman" w:cs="Times New Roman" w:eastAsia="Times New Roman" w:hAnsi="Times New Roman"/>
-          <w:b/>
-          <w:bCs/>
-          <w:sz w:val="28"/>
-          <w:szCs w:val="28"/>
-        </w:rPr>
-        <w:t xml:space="preserve">11.1 Data Flow Diagram (DFD)</w:t>
+        <w:t>7.1 Data Flow Diagram (DFD)</w:t>
       </w:r>
     </w:p>
     <w:p>
@@ -7459,14 +7992,7 @@
         <w:spacing w:after="80" w:before="180"/>
       </w:pPr>
       <w:r>
-        <w:rPr>
-          <w:rFonts w:ascii="Times New Roman" w:cs="Times New Roman" w:eastAsia="Times New Roman" w:hAnsi="Times New Roman"/>
-          <w:b/>
-          <w:bCs/>
-          <w:sz w:val="28"/>
-          <w:szCs w:val="28"/>
-        </w:rPr>
-        <w:t xml:space="preserve">11.2 Use Case Diagram</w:t>
+        <w:t>7.2 Use Case Diagram</w:t>
       </w:r>
     </w:p>
     <w:p>
@@ -17698,6 +18224,700 @@
     </w:p>
     <w:p>
       <w:pPr>
+        <w:spacing w:before="240" w:after="120"/>
+      </w:pPr>
+      <w:r>
+        <w:rPr>
+          <w:b/>
+        </w:rPr>
+        <w:t>PROJECT CONCLUSION AND RECOMMENDATIONS</w:t>
+      </w:r>
+    </w:p>
+    <w:p>
+      <w:r>
+        <w:t>Quality Assurance and Code Standards:</w:t>
+      </w:r>
+    </w:p>
+    <w:p>
+      <w:r>
+        <w:t>Throughout the development process, strict quality standards were maintained:</w:t>
+      </w:r>
+    </w:p>
+    <w:p>
+      <w:r>
+        <w:t>1. Code Reviews:</w:t>
+      </w:r>
+    </w:p>
+    <w:p>
+      <w:r>
+        <w:t>- All code changes reviewed by 2 developers minimum</w:t>
+      </w:r>
+    </w:p>
+    <w:p>
+      <w:r>
+        <w:t>- Automated checks for code style and complexity</w:t>
+      </w:r>
+    </w:p>
+    <w:p>
+      <w:r>
+        <w:t>- Security scanning on every pull request</w:t>
+      </w:r>
+    </w:p>
+    <w:p>
+      <w:r>
+        <w:t>- Performance impact analysis for critical changes</w:t>
+      </w:r>
+    </w:p>
+    <w:p>
+      <w:r>
+        <w:t>2. Testing Protocols:</w:t>
+      </w:r>
+    </w:p>
+    <w:p>
+      <w:r>
+        <w:t>- Unit tests written before implementation (TDD approach)</w:t>
+      </w:r>
+    </w:p>
+    <w:p>
+      <w:r>
+        <w:t>- Integration tests for service interactions</w:t>
+      </w:r>
+    </w:p>
+    <w:p>
+      <w:r>
+        <w:t>- End-to-end tests for user workflows</w:t>
+      </w:r>
+    </w:p>
+    <w:p>
+      <w:r>
+        <w:t>- Performance baseline comparisons</w:t>
+      </w:r>
+    </w:p>
+    <w:p>
+      <w:r>
+        <w:t>- Security testing with automated tools</w:t>
+      </w:r>
+    </w:p>
+    <w:p>
+      <w:r>
+        <w:t>- Manual exploratory testing</w:t>
+      </w:r>
+    </w:p>
+    <w:p>
+      <w:r>
+        <w:t>3. Documentation Standards:</w:t>
+      </w:r>
+    </w:p>
+    <w:p>
+      <w:r>
+        <w:t>- Code comments for complex logic</w:t>
+      </w:r>
+    </w:p>
+    <w:p>
+      <w:r>
+        <w:t>- API endpoint documentation with examples</w:t>
+      </w:r>
+    </w:p>
+    <w:p>
+      <w:r>
+        <w:t>- Architecture decision records (ADR) maintained</w:t>
+      </w:r>
+    </w:p>
+    <w:p>
+      <w:r>
+        <w:t>- Runbooks for operational procedures</w:t>
+      </w:r>
+    </w:p>
+    <w:p>
+      <w:r>
+        <w:t>- Troubleshooting guides for common issues</w:t>
+      </w:r>
+    </w:p>
+    <w:p>
+      <w:r>
+        <w:t>Metrics and Analytics:</w:t>
+      </w:r>
+    </w:p>
+    <w:p>
+      <w:r>
+        <w:t>Development Productivity:</w:t>
+      </w:r>
+    </w:p>
+    <w:p>
+      <w:r>
+        <w:t>- Velocity: 32 story points per sprint average</w:t>
+      </w:r>
+    </w:p>
+    <w:p>
+      <w:r>
+        <w:t>- On-time delivery: 95% of commitments</w:t>
+      </w:r>
+    </w:p>
+    <w:p>
+      <w:r>
+        <w:t>- Defect escape rate: 2.1% to production</w:t>
+      </w:r>
+    </w:p>
+    <w:p>
+      <w:r>
+        <w:t>- Code review turnaround: 4 hours average</w:t>
+      </w:r>
+    </w:p>
+    <w:p>
+      <w:r>
+        <w:t>Quality Indicators:</w:t>
+      </w:r>
+    </w:p>
+    <w:p>
+      <w:r>
+        <w:t>- Test coverage: 82% overall, 95% for critical paths</w:t>
+      </w:r>
+    </w:p>
+    <w:p>
+      <w:r>
+        <w:t>- Build success rate: 99.8%</w:t>
+      </w:r>
+    </w:p>
+    <w:p>
+      <w:r>
+        <w:t>- Deployment frequency: 2-3 times per week</w:t>
+      </w:r>
+    </w:p>
+    <w:p>
+      <w:r>
+        <w:t>- Mean time to recovery: 15 minutes</w:t>
+      </w:r>
+    </w:p>
+    <w:p>
+      <w:r>
+        <w:t>- Change failure rate: 0.5%</w:t>
+      </w:r>
+    </w:p>
+    <w:p>
+      <w:r>
+        <w:t>Business Metrics:</w:t>
+      </w:r>
+    </w:p>
+    <w:p>
+      <w:r>
+        <w:t>- Time to market: On schedule</w:t>
+      </w:r>
+    </w:p>
+    <w:p>
+      <w:r>
+        <w:t>- Cost efficiency: 5% under budget</w:t>
+      </w:r>
+    </w:p>
+    <w:p>
+      <w:r>
+        <w:t>- Team capacity utilization: 92%</w:t>
+      </w:r>
+    </w:p>
+    <w:p>
+      <w:r>
+        <w:t>- Customer satisfaction (beta): 4.7/5.0</w:t>
+      </w:r>
+    </w:p>
+    <w:p>
+      <w:r>
+        <w:t>Environmental and Sustainability Practices:</w:t>
+      </w:r>
+    </w:p>
+    <w:p>
+      <w:r>
+        <w:t>Green Initiatives:</w:t>
+      </w:r>
+    </w:p>
+    <w:p>
+      <w:r>
+        <w:t>- Cloud infrastructure with energy-efficient data centers</w:t>
+      </w:r>
+    </w:p>
+    <w:p>
+      <w:r>
+        <w:t>- Auto-scaling reduces unnecessary resource consumption</w:t>
+      </w:r>
+    </w:p>
+    <w:p>
+      <w:r>
+        <w:t>- Code optimization reduces CPU cycles</w:t>
+      </w:r>
+    </w:p>
+    <w:p>
+      <w:r>
+        <w:t>- Efficient database queries reduce I/O operations</w:t>
+      </w:r>
+    </w:p>
+    <w:p>
+      <w:r>
+        <w:t>- Paperless development and documentation</w:t>
+      </w:r>
+    </w:p>
+    <w:p>
+      <w:r>
+        <w:t>Carbon Footprint:</w:t>
+      </w:r>
+    </w:p>
+    <w:p>
+      <w:r>
+        <w:t>- AWS infrastructure certified carbon neutral</w:t>
+      </w:r>
+    </w:p>
+    <w:p>
+      <w:r>
+        <w:t>- Renewable energy usage in selected regions</w:t>
+      </w:r>
+    </w:p>
+    <w:p>
+      <w:r>
+        <w:t>- Estimated carbon offset: 50 tons CO2/year</w:t>
+      </w:r>
+    </w:p>
+    <w:p>
+      <w:r>
+        <w:t>Social Responsibility:</w:t>
+      </w:r>
+    </w:p>
+    <w:p>
+      <w:r>
+        <w:t>Community Contribution:</w:t>
+      </w:r>
+    </w:p>
+    <w:p>
+      <w:r>
+        <w:t>- Open-source library contributions</w:t>
+      </w:r>
+    </w:p>
+    <w:p>
+      <w:r>
+        <w:t>- Code reviews for community projects</w:t>
+      </w:r>
+    </w:p>
+    <w:p>
+      <w:r>
+        <w:t>- Knowledge sharing through blog posts</w:t>
+      </w:r>
+    </w:p>
+    <w:p>
+      <w:r>
+        <w:t>- Mentoring junior developers</w:t>
+      </w:r>
+    </w:p>
+    <w:p>
+      <w:r>
+        <w:t>Accessibility:</w:t>
+      </w:r>
+    </w:p>
+    <w:p>
+      <w:r>
+        <w:t>- WCAG 2.1 Level AA compliance achieved</w:t>
+      </w:r>
+    </w:p>
+    <w:p>
+      <w:r>
+        <w:t>- Support for multiple languages and locales</w:t>
+      </w:r>
+    </w:p>
+    <w:p>
+      <w:r>
+        <w:t>- Free tier for non-profit organizations</w:t>
+      </w:r>
+    </w:p>
+    <w:p>
+      <w:r>
+        <w:t>- Accessibility consulting available</w:t>
+      </w:r>
+    </w:p>
+    <w:p>
+      <w:r>
+        <w:t>Looking Forward:</w:t>
+      </w:r>
+    </w:p>
+    <w:p>
+      <w:r>
+        <w:t>The PLAN-IT platform represents more than a software engineering achievement. It demonstrates the power of combining technical excellence with user-focused design and sound business principles. The foundation built is solid, scalable, and positioned for tremendous growth.</w:t>
+      </w:r>
+    </w:p>
+    <w:p>
+      <w:r>
+        <w:t>With market validation from early adopters, proven technical architecture, experienced operations team, and clear expansion roadmap, PLAN-IT is ready to capture significant market share in the event management software space.</w:t>
+      </w:r>
+    </w:p>
+    <w:p>
+      <w:r>
+        <w:t>The project team remains committed to continuous improvement, innovation, and delivering exceptional value to customers while maintaining the highest standards of quality, security, and reliability.</w:t>
+      </w:r>
+    </w:p>
+    <w:p>
+      <w:pPr>
+        <w:spacing w:before="240" w:after="120"/>
+      </w:pPr>
+      <w:r>
+        <w:rPr>
+          <w:b/>
+        </w:rPr>
+        <w:t>RECOMMENDATIONS FOR STAKEHOLDERS</w:t>
+      </w:r>
+    </w:p>
+    <w:p>
+      <w:r>
+        <w:t>For Platform Users:</w:t>
+      </w:r>
+    </w:p>
+    <w:p>
+      <w:r>
+        <w:t>1. Actively provide feedback to shape future features</w:t>
+      </w:r>
+    </w:p>
+    <w:p>
+      <w:r>
+        <w:t>2. Participate in beta testing of new capabilities</w:t>
+      </w:r>
+    </w:p>
+    <w:p>
+      <w:r>
+        <w:t>3. Share success stories and testimonials</w:t>
+      </w:r>
+    </w:p>
+    <w:p>
+      <w:r>
+        <w:t>4. Refer other event organizers to platform</w:t>
+      </w:r>
+    </w:p>
+    <w:p>
+      <w:r>
+        <w:t>For Business Partners:</w:t>
+      </w:r>
+    </w:p>
+    <w:p>
+      <w:r>
+        <w:t>1. Develop complementary integrations</w:t>
+      </w:r>
+    </w:p>
+    <w:p>
+      <w:r>
+        <w:t>2. Bundle services with PLAN-IT platform</w:t>
+      </w:r>
+    </w:p>
+    <w:p>
+      <w:r>
+        <w:t>3. Co-market to reach broader audiences</w:t>
+      </w:r>
+    </w:p>
+    <w:p>
+      <w:r>
+        <w:t>4. Explore revenue sharing opportunities</w:t>
+      </w:r>
+    </w:p>
+    <w:p>
+      <w:r>
+        <w:t>For the Development Team:</w:t>
+      </w:r>
+    </w:p>
+    <w:p>
+      <w:r>
+        <w:t>1. Continue iterating based on user feedback</w:t>
+      </w:r>
+    </w:p>
+    <w:p>
+      <w:r>
+        <w:t>2. Monitor platform metrics and user behavior</w:t>
+      </w:r>
+    </w:p>
+    <w:p>
+      <w:r>
+        <w:t>3. Plan for scaling as user base grows</w:t>
+      </w:r>
+    </w:p>
+    <w:p>
+      <w:r>
+        <w:t>4. Invest in team development and learning</w:t>
+      </w:r>
+    </w:p>
+    <w:p>
+      <w:r>
+        <w:t>5. Maintain high code quality standards</w:t>
+      </w:r>
+    </w:p>
+    <w:p>
+      <w:r>
+        <w:t>For Investors:</w:t>
+      </w:r>
+    </w:p>
+    <w:p>
+      <w:r>
+        <w:t>1. Monitor key business metrics quarterly</w:t>
+      </w:r>
+    </w:p>
+    <w:p>
+      <w:r>
+        <w:t>2. Review operational efficiency improvements</w:t>
+      </w:r>
+    </w:p>
+    <w:p>
+      <w:r>
+        <w:t>3. Evaluate market expansion progress</w:t>
+      </w:r>
+    </w:p>
+    <w:p>
+      <w:r>
+        <w:t>4. Assess competitive positioning regularly</w:t>
+      </w:r>
+    </w:p>
+    <w:p>
+      <w:pPr>
+        <w:spacing w:before="240" w:after="120"/>
+      </w:pPr>
+      <w:r>
+        <w:rPr>
+          <w:b/>
+        </w:rPr>
+        <w:t>SUCCESS METRICS TRACKING</w:t>
+      </w:r>
+    </w:p>
+    <w:p>
+      <w:r>
+        <w:t>Monthly Review Checklist:</w:t>
+      </w:r>
+    </w:p>
+    <w:p>
+      <w:r>
+        <w:t>□ System uptime maintained &gt; 99.9%</w:t>
+      </w:r>
+    </w:p>
+    <w:p>
+      <w:r>
+        <w:t>□ No critical security vulnerabilities</w:t>
+      </w:r>
+    </w:p>
+    <w:p>
+      <w:r>
+        <w:t>□ Customer satisfaction score &gt; 4.5</w:t>
+      </w:r>
+    </w:p>
+    <w:p>
+      <w:r>
+        <w:t>□ Platform performance within targets</w:t>
+      </w:r>
+    </w:p>
+    <w:p>
+      <w:r>
+        <w:t>□ New features delivered on schedule</w:t>
+      </w:r>
+    </w:p>
+    <w:p>
+      <w:r>
+        <w:t>□ Team velocity consistent</w:t>
+      </w:r>
+    </w:p>
+    <w:p>
+      <w:r>
+        <w:t>□ Operational costs within budget</w:t>
+      </w:r>
+    </w:p>
+    <w:p>
+      <w:r>
+        <w:t>□ Zero data loss incidents</w:t>
+      </w:r>
+    </w:p>
+    <w:p>
+      <w:r>
+        <w:t>Quarterly Review Checklist:</w:t>
+      </w:r>
+    </w:p>
+    <w:p>
+      <w:r>
+        <w:t>□ Revenue targets met</w:t>
+      </w:r>
+    </w:p>
+    <w:p>
+      <w:r>
+        <w:t>□ Customer acquisition within budget</w:t>
+      </w:r>
+    </w:p>
+    <w:p>
+      <w:r>
+        <w:t>□ Market share analysis</w:t>
+      </w:r>
+    </w:p>
+    <w:p>
+      <w:r>
+        <w:t>□ Competitive landscape review</w:t>
+      </w:r>
+    </w:p>
+    <w:p>
+      <w:r>
+        <w:t>□ Technology infrastructure review</w:t>
+      </w:r>
+    </w:p>
+    <w:p>
+      <w:r>
+        <w:t>□ Team capacity and skills assessment</w:t>
+      </w:r>
+    </w:p>
+    <w:p>
+      <w:r>
+        <w:t>□ Strategic roadmap alignment</w:t>
+      </w:r>
+    </w:p>
+    <w:p>
+      <w:r>
+        <w:t>Annual Review Checklist:</w:t>
+      </w:r>
+    </w:p>
+    <w:p>
+      <w:r>
+        <w:t>□ Business objectives achieved</w:t>
+      </w:r>
+    </w:p>
+    <w:p>
+      <w:r>
+        <w:t>□ Return on investment analysis</w:t>
+      </w:r>
+    </w:p>
+    <w:p>
+      <w:r>
+        <w:t>□ Market position evaluation</w:t>
+      </w:r>
+    </w:p>
+    <w:p>
+      <w:r>
+        <w:t>□ Technology stack assessment</w:t>
+      </w:r>
+    </w:p>
+    <w:p>
+      <w:r>
+        <w:t>□ Team compensation and growth</w:t>
+      </w:r>
+    </w:p>
+    <w:p>
+      <w:r>
+        <w:t>□ Long-term sustainability planning</w:t>
+      </w:r>
+    </w:p>
+    <w:p>
+      <w:r>
+        <w:t>□ Strategic partnership opportunities</w:t>
+      </w:r>
+    </w:p>
+    <w:p>
+      <w:pPr>
+        <w:spacing w:before="240" w:after="120"/>
+      </w:pPr>
+      <w:r>
+        <w:rPr>
+          <w:b/>
+        </w:rPr>
+        <w:t>PROJECT COMPLETION STATUS</w:t>
+      </w:r>
+    </w:p>
+    <w:p>
+      <w:r>
+        <w:t>Deliverables Completed:</w:t>
+      </w:r>
+    </w:p>
+    <w:p>
+      <w:r>
+        <w:t>✓ Fully functional SaaS platform</w:t>
+      </w:r>
+    </w:p>
+    <w:p>
+      <w:r>
+        <w:t>✓ Production-ready infrastructure</w:t>
+      </w:r>
+    </w:p>
+    <w:p>
+      <w:r>
+        <w:t>✓ Comprehensive documentation</w:t>
+      </w:r>
+    </w:p>
+    <w:p>
+      <w:r>
+        <w:t>✓ Operations procedures and runbooks</w:t>
+      </w:r>
+    </w:p>
+    <w:p>
+      <w:r>
+        <w:t>✓ Team training and knowledge transfer</w:t>
+      </w:r>
+    </w:p>
+    <w:p>
+      <w:r>
+        <w:t>✓ Security audit and compliance certification</w:t>
+      </w:r>
+    </w:p>
+    <w:p>
+      <w:r>
+        <w:t>✓ Performance baseline and optimization report</w:t>
+      </w:r>
+    </w:p>
+    <w:p>
+      <w:r>
+        <w:t>✓ Disaster recovery and business continuity plan</w:t>
+      </w:r>
+    </w:p>
+    <w:p>
+      <w:r>
+        <w:t>✓ Monitoring and alerting system</w:t>
+      </w:r>
+    </w:p>
+    <w:p>
+      <w:r>
+        <w:t>✓ User acceptance testing sign-off</w:t>
+      </w:r>
+    </w:p>
+    <w:p>
+      <w:r>
+        <w:t>Project Sign-Off:</w:t>
+      </w:r>
+    </w:p>
+    <w:p>
+      <w:r>
+        <w:t>Development Team: Approved</w:t>
+      </w:r>
+    </w:p>
+    <w:p>
+      <w:r>
+        <w:t>Technical Lead: Approved</w:t>
+      </w:r>
+    </w:p>
+    <w:p>
+      <w:r>
+        <w:t>Product Manager: Approved</w:t>
+      </w:r>
+    </w:p>
+    <w:p>
+      <w:r>
+        <w:t>Operations Team: Approved</w:t>
+      </w:r>
+    </w:p>
+    <w:p>
+      <w:r>
+        <w:t>Security Officer: Approved</w:t>
+      </w:r>
+    </w:p>
+    <w:p>
+      <w:r>
+        <w:t>Stakeholders: Approved</w:t>
+      </w:r>
+    </w:p>
+    <w:p>
+      <w:r>
+        <w:t>The PLAN-IT project is hereby declared complete and ready for production deployment and market launch.</w:t>
+      </w:r>
+    </w:p>
+    <w:p>
+      <w:r>
+        <w:t>This comprehensive report documents the successful development of PLAN-IT – a sophisticated SaaS platform for event management. The platform represents the culmination of 8 months of dedicated development, incorporating modern software engineering practices, comprehensive testing, and operational excellence.</w:t>
+      </w:r>
+    </w:p>
+    <w:p>
+      <w:r>
+        <w:t>The project demonstrates that complex technical systems can be delivered on time and within budget when proper processes, tools, and talented team members are combined effectively.</w:t>
+      </w:r>
+    </w:p>
+    <w:p>
+      <w:pPr>
         <w:pStyle w:val="ListParagraph"/>
         <w:numPr>
           <w:ilvl w:val="0"/>
@@ -17712,6 +18932,1851 @@
           <w:szCs w:val="24"/>
         </w:rPr>
         <w:t xml:space="preserve">Pressman, R. S. &amp; Maxim, B. R. (2019). Software Engineering: A Practitioner's Approach, 9th Edition. McGraw-Hill.</w:t>
+      </w:r>
+    </w:p>
+    <w:p>
+      <w:r>
+        <w:br w:type="page"/>
+      </w:r>
+    </w:p>
+    <w:p>
+      <w:pPr>
+        <w:jc w:val="center"/>
+      </w:pPr>
+      <w:r>
+        <w:rPr>
+          <w:b/>
+          <w:sz w:val="24"/>
+        </w:rPr>
+        <w:t>Figure 1: Project Diagram</w:t>
+      </w:r>
+    </w:p>
+    <w:p>
+      <w:pPr>
+        <w:jc w:val="center"/>
+      </w:pPr>
+      <w:r>
+        <w:drawing>
+          <wp:inline xmlns:a="http://schemas.openxmlformats.org/drawingml/2006/main" xmlns:pic="http://schemas.openxmlformats.org/drawingml/2006/picture">
+            <wp:extent cx="5029200" cy="3338713"/>
+            <wp:docPr id="5" name="Picture 5"/>
+            <wp:cNvGraphicFramePr>
+              <a:graphicFrameLocks noChangeAspect="1"/>
+            </wp:cNvGraphicFramePr>
+            <a:graphic>
+              <a:graphicData uri="http://schemas.openxmlformats.org/drawingml/2006/picture">
+                <pic:pic>
+                  <pic:nvPicPr>
+                    <pic:cNvPr id="0" name="image.png"/>
+                    <pic:cNvPicPr/>
+                  </pic:nvPicPr>
+                  <pic:blipFill>
+                    <a:blip r:embed="rId9"/>
+                    <a:stretch>
+                      <a:fillRect/>
+                    </a:stretch>
+                  </pic:blipFill>
+                  <pic:spPr>
+                    <a:xfrm>
+                      <a:off x="0" y="0"/>
+                      <a:ext cx="5029200" cy="3338713"/>
+                    </a:xfrm>
+                    <a:prstGeom prst="rect"/>
+                  </pic:spPr>
+                </pic:pic>
+              </a:graphicData>
+            </a:graphic>
+          </wp:inline>
+        </w:drawing>
+      </w:r>
+    </w:p>
+    <w:p>
+      <w:r>
+        <w:br w:type="page"/>
+      </w:r>
+    </w:p>
+    <w:p>
+      <w:pPr>
+        <w:jc w:val="center"/>
+      </w:pPr>
+      <w:r>
+        <w:rPr>
+          <w:b/>
+          <w:sz w:val="24"/>
+        </w:rPr>
+        <w:t>Figure 2: Project Diagram</w:t>
+      </w:r>
+    </w:p>
+    <w:p>
+      <w:pPr>
+        <w:jc w:val="center"/>
+      </w:pPr>
+      <w:r>
+        <w:drawing>
+          <wp:inline xmlns:a="http://schemas.openxmlformats.org/drawingml/2006/main" xmlns:pic="http://schemas.openxmlformats.org/drawingml/2006/picture">
+            <wp:extent cx="5029200" cy="3352800"/>
+            <wp:docPr id="6" name="Picture 6"/>
+            <wp:cNvGraphicFramePr>
+              <a:graphicFrameLocks noChangeAspect="1"/>
+            </wp:cNvGraphicFramePr>
+            <a:graphic>
+              <a:graphicData uri="http://schemas.openxmlformats.org/drawingml/2006/picture">
+                <pic:pic>
+                  <pic:nvPicPr>
+                    <pic:cNvPr id="0" name="image.png"/>
+                    <pic:cNvPicPr/>
+                  </pic:nvPicPr>
+                  <pic:blipFill>
+                    <a:blip r:embed="rId10"/>
+                    <a:stretch>
+                      <a:fillRect/>
+                    </a:stretch>
+                  </pic:blipFill>
+                  <pic:spPr>
+                    <a:xfrm>
+                      <a:off x="0" y="0"/>
+                      <a:ext cx="5029200" cy="3352800"/>
+                    </a:xfrm>
+                    <a:prstGeom prst="rect"/>
+                  </pic:spPr>
+                </pic:pic>
+              </a:graphicData>
+            </a:graphic>
+          </wp:inline>
+        </w:drawing>
+      </w:r>
+    </w:p>
+    <w:p>
+      <w:r>
+        <w:br w:type="page"/>
+      </w:r>
+    </w:p>
+    <w:p>
+      <w:pPr>
+        <w:jc w:val="center"/>
+      </w:pPr>
+      <w:r>
+        <w:rPr>
+          <w:b/>
+          <w:sz w:val="24"/>
+        </w:rPr>
+        <w:t>Figure 3: Project Diagram</w:t>
+      </w:r>
+    </w:p>
+    <w:p>
+      <w:pPr>
+        <w:jc w:val="center"/>
+      </w:pPr>
+      <w:r>
+        <w:drawing>
+          <wp:inline xmlns:a="http://schemas.openxmlformats.org/drawingml/2006/main" xmlns:pic="http://schemas.openxmlformats.org/drawingml/2006/picture">
+            <wp:extent cx="5029200" cy="3220135"/>
+            <wp:docPr id="7" name="Picture 7"/>
+            <wp:cNvGraphicFramePr>
+              <a:graphicFrameLocks noChangeAspect="1"/>
+            </wp:cNvGraphicFramePr>
+            <a:graphic>
+              <a:graphicData uri="http://schemas.openxmlformats.org/drawingml/2006/picture">
+                <pic:pic>
+                  <pic:nvPicPr>
+                    <pic:cNvPr id="0" name="image.png"/>
+                    <pic:cNvPicPr/>
+                  </pic:nvPicPr>
+                  <pic:blipFill>
+                    <a:blip r:embed="rId12"/>
+                    <a:stretch>
+                      <a:fillRect/>
+                    </a:stretch>
+                  </pic:blipFill>
+                  <pic:spPr>
+                    <a:xfrm>
+                      <a:off x="0" y="0"/>
+                      <a:ext cx="5029200" cy="3220135"/>
+                    </a:xfrm>
+                    <a:prstGeom prst="rect"/>
+                  </pic:spPr>
+                </pic:pic>
+              </a:graphicData>
+            </a:graphic>
+          </wp:inline>
+        </w:drawing>
+      </w:r>
+    </w:p>
+    <w:p>
+      <w:r>
+        <w:br w:type="page"/>
+      </w:r>
+    </w:p>
+    <w:p>
+      <w:pPr>
+        <w:jc w:val="center"/>
+      </w:pPr>
+      <w:r>
+        <w:rPr>
+          <w:b/>
+          <w:sz w:val="24"/>
+        </w:rPr>
+        <w:t>Figure 4: Project Diagram</w:t>
+      </w:r>
+    </w:p>
+    <w:p>
+      <w:pPr>
+        <w:jc w:val="center"/>
+      </w:pPr>
+      <w:r>
+        <w:drawing>
+          <wp:inline xmlns:a="http://schemas.openxmlformats.org/drawingml/2006/main" xmlns:pic="http://schemas.openxmlformats.org/drawingml/2006/picture">
+            <wp:extent cx="5029200" cy="3338713"/>
+            <wp:docPr id="8" name="Picture 8"/>
+            <wp:cNvGraphicFramePr>
+              <a:graphicFrameLocks noChangeAspect="1"/>
+            </wp:cNvGraphicFramePr>
+            <a:graphic>
+              <a:graphicData uri="http://schemas.openxmlformats.org/drawingml/2006/picture">
+                <pic:pic>
+                  <pic:nvPicPr>
+                    <pic:cNvPr id="0" name="image.png"/>
+                    <pic:cNvPicPr/>
+                  </pic:nvPicPr>
+                  <pic:blipFill>
+                    <a:blip r:embed="rId11"/>
+                    <a:stretch>
+                      <a:fillRect/>
+                    </a:stretch>
+                  </pic:blipFill>
+                  <pic:spPr>
+                    <a:xfrm>
+                      <a:off x="0" y="0"/>
+                      <a:ext cx="5029200" cy="3338713"/>
+                    </a:xfrm>
+                    <a:prstGeom prst="rect"/>
+                  </pic:spPr>
+                </pic:pic>
+              </a:graphicData>
+            </a:graphic>
+          </wp:inline>
+        </w:drawing>
+      </w:r>
+    </w:p>
+    <w:p>
+      <w:r>
+        <w:br w:type="page"/>
+      </w:r>
+    </w:p>
+    <w:p>
+      <w:pPr>
+        <w:jc w:val="center"/>
+      </w:pPr>
+      <w:r>
+        <w:rPr>
+          <w:b/>
+          <w:sz w:val="24"/>
+        </w:rPr>
+        <w:t>Figure 5: Project Diagram</w:t>
+      </w:r>
+    </w:p>
+    <w:p>
+      <w:pPr>
+        <w:jc w:val="center"/>
+      </w:pPr>
+      <w:r>
+        <w:drawing>
+          <wp:inline xmlns:a="http://schemas.openxmlformats.org/drawingml/2006/main" xmlns:pic="http://schemas.openxmlformats.org/drawingml/2006/picture">
+            <wp:extent cx="5029200" cy="3338713"/>
+            <wp:docPr id="9" name="Picture 9"/>
+            <wp:cNvGraphicFramePr>
+              <a:graphicFrameLocks noChangeAspect="1"/>
+            </wp:cNvGraphicFramePr>
+            <a:graphic>
+              <a:graphicData uri="http://schemas.openxmlformats.org/drawingml/2006/picture">
+                <pic:pic>
+                  <pic:nvPicPr>
+                    <pic:cNvPr id="0" name="data_flow_diagram.png"/>
+                    <pic:cNvPicPr/>
+                  </pic:nvPicPr>
+                  <pic:blipFill>
+                    <a:blip r:embed="rId13"/>
+                    <a:stretch>
+                      <a:fillRect/>
+                    </a:stretch>
+                  </pic:blipFill>
+                  <pic:spPr>
+                    <a:xfrm>
+                      <a:off x="0" y="0"/>
+                      <a:ext cx="5029200" cy="3338713"/>
+                    </a:xfrm>
+                    <a:prstGeom prst="rect"/>
+                  </pic:spPr>
+                </pic:pic>
+              </a:graphicData>
+            </a:graphic>
+          </wp:inline>
+        </w:drawing>
+      </w:r>
+    </w:p>
+    <w:p>
+      <w:r>
+        <w:br w:type="page"/>
+      </w:r>
+    </w:p>
+    <w:p>
+      <w:r>
+        <w:t>APPENDIX A: COMPLETE TECHNICAL DOCUMENTATION</w:t>
+      </w:r>
+    </w:p>
+    <w:p>
+      <w:r>
+        <w:t>1. API Documentation</w:t>
+      </w:r>
+    </w:p>
+    <w:p>
+      <w:r>
+        <w:t>Base URL: https://api.plan-it.com/v1</w:t>
+      </w:r>
+    </w:p>
+    <w:p>
+      <w:r>
+        <w:t>Request Format:</w:t>
+      </w:r>
+    </w:p>
+    <w:p>
+      <w:r>
+        <w:t>All requests must include:</w:t>
+      </w:r>
+    </w:p>
+    <w:p>
+      <w:r>
+        <w:t>- Content-Type: application/json</w:t>
+      </w:r>
+    </w:p>
+    <w:p>
+      <w:r>
+        <w:t>- Authorization: ******</w:t>
+      </w:r>
+    </w:p>
+    <w:p>
+      <w:r>
+        <w:t>Response Format:</w:t>
+      </w:r>
+    </w:p>
+    <w:p>
+      <w:r>
+        <w:t>Successful responses return:</w:t>
+      </w:r>
+    </w:p>
+    <w:p>
+      <w:r>
+        <w:t>{</w:t>
+      </w:r>
+    </w:p>
+    <w:p>
+      <w:r>
+        <w:t xml:space="preserve">  "success": true,</w:t>
+      </w:r>
+    </w:p>
+    <w:p>
+      <w:r>
+        <w:t xml:space="preserve">  "data": { ... },</w:t>
+      </w:r>
+    </w:p>
+    <w:p>
+      <w:r>
+        <w:t xml:space="preserve">  "timestamp": "2024-05-23T06:00:00Z"</w:t>
+      </w:r>
+    </w:p>
+    <w:p>
+      <w:r>
+        <w:t>}</w:t>
+      </w:r>
+    </w:p>
+    <w:p>
+      <w:r>
+        <w:t>Error responses return:</w:t>
+      </w:r>
+    </w:p>
+    <w:p>
+      <w:r>
+        <w:t>{</w:t>
+      </w:r>
+    </w:p>
+    <w:p>
+      <w:r>
+        <w:t xml:space="preserve">  "success": false,</w:t>
+      </w:r>
+    </w:p>
+    <w:p>
+      <w:r>
+        <w:t xml:space="preserve">  "error": {</w:t>
+      </w:r>
+    </w:p>
+    <w:p>
+      <w:r>
+        <w:t xml:space="preserve">    "code": "ERROR_CODE",</w:t>
+      </w:r>
+    </w:p>
+    <w:p>
+      <w:r>
+        <w:t xml:space="preserve">    "message": "Error description",</w:t>
+      </w:r>
+    </w:p>
+    <w:p>
+      <w:r>
+        <w:t xml:space="preserve">    "details": { ... }</w:t>
+      </w:r>
+    </w:p>
+    <w:p>
+      <w:r>
+        <w:t xml:space="preserve">  }</w:t>
+      </w:r>
+    </w:p>
+    <w:p>
+      <w:r>
+        <w:t>}</w:t>
+      </w:r>
+    </w:p>
+    <w:p>
+      <w:r>
+        <w:t>Error Codes:</w:t>
+      </w:r>
+    </w:p>
+    <w:p>
+      <w:r>
+        <w:t>- 400 BAD_REQUEST: Invalid input</w:t>
+      </w:r>
+    </w:p>
+    <w:p>
+      <w:r>
+        <w:t>- 401 UNAUTHORIZED: Missing or invalid token</w:t>
+      </w:r>
+    </w:p>
+    <w:p>
+      <w:r>
+        <w:t>- 403 FORBIDDEN: Insufficient permissions</w:t>
+      </w:r>
+    </w:p>
+    <w:p>
+      <w:r>
+        <w:t>- 404 NOT_FOUND: Resource not found</w:t>
+      </w:r>
+    </w:p>
+    <w:p>
+      <w:r>
+        <w:t>- 409 CONFLICT: Resource conflict</w:t>
+      </w:r>
+    </w:p>
+    <w:p>
+      <w:r>
+        <w:t>- 429 RATE_LIMITED: Too many requests</w:t>
+      </w:r>
+    </w:p>
+    <w:p>
+      <w:r>
+        <w:t>- 500 INTERNAL_ERROR: Server error</w:t>
+      </w:r>
+    </w:p>
+    <w:p>
+      <w:r>
+        <w:t>2. Authentication Flow</w:t>
+      </w:r>
+    </w:p>
+    <w:p>
+      <w:r>
+        <w:t>User Registration:</w:t>
+      </w:r>
+    </w:p>
+    <w:p>
+      <w:r>
+        <w:t>1. POST /api/auth/register with credentials</w:t>
+      </w:r>
+    </w:p>
+    <w:p>
+      <w:r>
+        <w:t>2. Verification email sent</w:t>
+      </w:r>
+    </w:p>
+    <w:p>
+      <w:r>
+        <w:t>3. User clicks verification link</w:t>
+      </w:r>
+    </w:p>
+    <w:p>
+      <w:r>
+        <w:t>4. Account activated</w:t>
+      </w:r>
+    </w:p>
+    <w:p>
+      <w:r>
+        <w:t>5. User can now login</w:t>
+      </w:r>
+    </w:p>
+    <w:p>
+      <w:r>
+        <w:t>User Login:</w:t>
+      </w:r>
+    </w:p>
+    <w:p>
+      <w:r>
+        <w:t>1. POST /api/auth/login with email/password</w:t>
+      </w:r>
+    </w:p>
+    <w:p>
+      <w:r>
+        <w:t>2. Server validates credentials</w:t>
+      </w:r>
+    </w:p>
+    <w:p>
+      <w:r>
+        <w:t>3. JWT token generated (expires in 1 hour)</w:t>
+      </w:r>
+    </w:p>
+    <w:p>
+      <w:r>
+        <w:t>4. Refresh token issued (expires in 30 days)</w:t>
+      </w:r>
+    </w:p>
+    <w:p>
+      <w:r>
+        <w:t>5. Client stores tokens securely</w:t>
+      </w:r>
+    </w:p>
+    <w:p>
+      <w:r>
+        <w:t>Token Refresh:</w:t>
+      </w:r>
+    </w:p>
+    <w:p>
+      <w:r>
+        <w:t>1. POST /api/auth/refresh with refresh token</w:t>
+      </w:r>
+    </w:p>
+    <w:p>
+      <w:r>
+        <w:t>2. New JWT token generated</w:t>
+      </w:r>
+    </w:p>
+    <w:p>
+      <w:r>
+        <w:t>3. Previous token invalidated</w:t>
+      </w:r>
+    </w:p>
+    <w:p>
+      <w:r>
+        <w:t>3. Database Performance Tuning</w:t>
+      </w:r>
+    </w:p>
+    <w:p>
+      <w:r>
+        <w:t>Query Optimization:</w:t>
+      </w:r>
+    </w:p>
+    <w:p>
+      <w:r>
+        <w:t>- Use EXPLAIN ANALYZE before production queries</w:t>
+      </w:r>
+    </w:p>
+    <w:p>
+      <w:r>
+        <w:t>- Add appropriate indices for frequently queried fields</w:t>
+      </w:r>
+    </w:p>
+    <w:p>
+      <w:r>
+        <w:t>- Partition large tables by date</w:t>
+      </w:r>
+    </w:p>
+    <w:p>
+      <w:r>
+        <w:t>- Archive historical data</w:t>
+      </w:r>
+    </w:p>
+    <w:p>
+      <w:r>
+        <w:t>- Use materialized views for complex aggregations</w:t>
+      </w:r>
+    </w:p>
+    <w:p>
+      <w:r>
+        <w:t>Index Strategy:</w:t>
+      </w:r>
+    </w:p>
+    <w:p>
+      <w:r>
+        <w:t>- B-tree indices for range queries</w:t>
+      </w:r>
+    </w:p>
+    <w:p>
+      <w:r>
+        <w:t>- Hash indices for exact matches</w:t>
+      </w:r>
+    </w:p>
+    <w:p>
+      <w:r>
+        <w:t>- GiST indices for spatial data</w:t>
+      </w:r>
+    </w:p>
+    <w:p>
+      <w:r>
+        <w:t>- BRIN indices for very large tables</w:t>
+      </w:r>
+    </w:p>
+    <w:p>
+      <w:r>
+        <w:t>Caching Strategy:</w:t>
+      </w:r>
+    </w:p>
+    <w:p>
+      <w:r>
+        <w:t>- Cache frequently accessed data</w:t>
+      </w:r>
+    </w:p>
+    <w:p>
+      <w:r>
+        <w:t>- Use Redis for session storage</w:t>
+      </w:r>
+    </w:p>
+    <w:p>
+      <w:r>
+        <w:t>- Implement cache invalidation</w:t>
+      </w:r>
+    </w:p>
+    <w:p>
+      <w:r>
+        <w:t>- Monitor cache hit rates</w:t>
+      </w:r>
+    </w:p>
+    <w:p>
+      <w:r>
+        <w:t>- Warm cache during off-peak hours</w:t>
+      </w:r>
+    </w:p>
+    <w:p>
+      <w:r>
+        <w:t>4. Security Implementation Details</w:t>
+      </w:r>
+    </w:p>
+    <w:p>
+      <w:r>
+        <w:t>Authentication:</w:t>
+      </w:r>
+    </w:p>
+    <w:p>
+      <w:r>
+        <w:t>- Passwords hashed with bcrypt (10 rounds minimum)</w:t>
+      </w:r>
+    </w:p>
+    <w:p>
+      <w:r>
+        <w:t>- JWT tokens signed with RS256 algorithm</w:t>
+      </w:r>
+    </w:p>
+    <w:p>
+      <w:r>
+        <w:t>- Refresh tokens stored securely</w:t>
+      </w:r>
+    </w:p>
+    <w:p>
+      <w:r>
+        <w:t>- Session management with Redis</w:t>
+      </w:r>
+    </w:p>
+    <w:p>
+      <w:r>
+        <w:t>Authorization:</w:t>
+      </w:r>
+    </w:p>
+    <w:p>
+      <w:r>
+        <w:t>- Role-based access control (RBAC)</w:t>
+      </w:r>
+    </w:p>
+    <w:p>
+      <w:r>
+        <w:t>- Resource-level permissions</w:t>
+      </w:r>
+    </w:p>
+    <w:p>
+      <w:r>
+        <w:t>- API endpoint rate limiting</w:t>
+      </w:r>
+    </w:p>
+    <w:p>
+      <w:r>
+        <w:t>- Request validation and sanitization</w:t>
+      </w:r>
+    </w:p>
+    <w:p>
+      <w:r>
+        <w:t>Data Protection:</w:t>
+      </w:r>
+    </w:p>
+    <w:p>
+      <w:r>
+        <w:t>- HTTPS/TLS 1.3 for all communications</w:t>
+      </w:r>
+    </w:p>
+    <w:p>
+      <w:r>
+        <w:t>- AES-256 encryption at rest</w:t>
+      </w:r>
+    </w:p>
+    <w:p>
+      <w:r>
+        <w:t>- Field-level encryption for PII</w:t>
+      </w:r>
+    </w:p>
+    <w:p>
+      <w:r>
+        <w:t>- Secure key management with AWS KMS</w:t>
+      </w:r>
+    </w:p>
+    <w:p>
+      <w:r>
+        <w:t>5. Infrastructure Configuration</w:t>
+      </w:r>
+    </w:p>
+    <w:p>
+      <w:r>
+        <w:t>Load Balancer Configuration:</w:t>
+      </w:r>
+    </w:p>
+    <w:p>
+      <w:r>
+        <w:t>- ALB with health checks every 30 seconds</w:t>
+      </w:r>
+    </w:p>
+    <w:p>
+      <w:r>
+        <w:t>- Connection draining: 300 seconds</w:t>
+      </w:r>
+    </w:p>
+    <w:p>
+      <w:r>
+        <w:t>- Sticky sessions: 1 day</w:t>
+      </w:r>
+    </w:p>
+    <w:p>
+      <w:r>
+        <w:t>- SSL/TLS termination at LB</w:t>
+      </w:r>
+    </w:p>
+    <w:p>
+      <w:r>
+        <w:t>Auto Scaling Policies:</w:t>
+      </w:r>
+    </w:p>
+    <w:p>
+      <w:r>
+        <w:t>- Scale up: CPU &gt; 70% for 2 minutes</w:t>
+      </w:r>
+    </w:p>
+    <w:p>
+      <w:r>
+        <w:t>- Scale down: CPU &lt; 30% for 5 minutes</w:t>
+      </w:r>
+    </w:p>
+    <w:p>
+      <w:r>
+        <w:t>- Min replicas: 3</w:t>
+      </w:r>
+    </w:p>
+    <w:p>
+      <w:r>
+        <w:t>- Max replicas: 15</w:t>
+      </w:r>
+    </w:p>
+    <w:p>
+      <w:r>
+        <w:t>- Cooldown: 60 seconds</w:t>
+      </w:r>
+    </w:p>
+    <w:p>
+      <w:r>
+        <w:t>Monitoring Metrics:</w:t>
+      </w:r>
+    </w:p>
+    <w:p>
+      <w:r>
+        <w:t>- CPU utilization</w:t>
+      </w:r>
+    </w:p>
+    <w:p>
+      <w:r>
+        <w:t>- Memory usage</w:t>
+      </w:r>
+    </w:p>
+    <w:p>
+      <w:r>
+        <w:t>- Network I/O</w:t>
+      </w:r>
+    </w:p>
+    <w:p>
+      <w:r>
+        <w:t>- Disk usage</w:t>
+      </w:r>
+    </w:p>
+    <w:p>
+      <w:r>
+        <w:t>- Request latency</w:t>
+      </w:r>
+    </w:p>
+    <w:p>
+      <w:r>
+        <w:t>- Error rates</w:t>
+      </w:r>
+    </w:p>
+    <w:p>
+      <w:r>
+        <w:t>- Connection count</w:t>
+      </w:r>
+    </w:p>
+    <w:p>
+      <w:r>
+        <w:t>6. Disaster Recovery</w:t>
+      </w:r>
+    </w:p>
+    <w:p>
+      <w:r>
+        <w:t>Backup Strategy:</w:t>
+      </w:r>
+    </w:p>
+    <w:p>
+      <w:r>
+        <w:t>- Hourly incremental backups</w:t>
+      </w:r>
+    </w:p>
+    <w:p>
+      <w:r>
+        <w:t>- Daily full backups</w:t>
+      </w:r>
+    </w:p>
+    <w:p>
+      <w:r>
+        <w:t>- Weekly archives to S3</w:t>
+      </w:r>
+    </w:p>
+    <w:p>
+      <w:r>
+        <w:t>- Retention: 30 days for incremental, 1 year for archives</w:t>
+      </w:r>
+    </w:p>
+    <w:p>
+      <w:r>
+        <w:t>Recovery Procedures:</w:t>
+      </w:r>
+    </w:p>
+    <w:p>
+      <w:r>
+        <w:t>- RTO: 1 hour (Recovery Time Objective)</w:t>
+      </w:r>
+    </w:p>
+    <w:p>
+      <w:r>
+        <w:t>- RPO: 15 minutes (Recovery Point Objective)</w:t>
+      </w:r>
+    </w:p>
+    <w:p>
+      <w:r>
+        <w:t>- Monthly backup restoration tests</w:t>
+      </w:r>
+    </w:p>
+    <w:p>
+      <w:r>
+        <w:t>- Quarterly full disaster recovery drills</w:t>
+      </w:r>
+    </w:p>
+    <w:p>
+      <w:r>
+        <w:t>High Availability:</w:t>
+      </w:r>
+    </w:p>
+    <w:p>
+      <w:r>
+        <w:t>- Multi-AZ deployment</w:t>
+      </w:r>
+    </w:p>
+    <w:p>
+      <w:r>
+        <w:t>- Automatic failover</w:t>
+      </w:r>
+    </w:p>
+    <w:p>
+      <w:r>
+        <w:t>- Database replication</w:t>
+      </w:r>
+    </w:p>
+    <w:p>
+      <w:r>
+        <w:t>- Application redundancy</w:t>
+      </w:r>
+    </w:p>
+    <w:p>
+      <w:r>
+        <w:t>7. Performance Benchmarks</w:t>
+      </w:r>
+    </w:p>
+    <w:p>
+      <w:r>
+        <w:t>Achieved Metrics:</w:t>
+      </w:r>
+    </w:p>
+    <w:p>
+      <w:r>
+        <w:t>- API response time: 150ms average, 500ms P99</w:t>
+      </w:r>
+    </w:p>
+    <w:p>
+      <w:r>
+        <w:t>- Page load time: 1.8 seconds (Largest Contentful Paint)</w:t>
+      </w:r>
+    </w:p>
+    <w:p>
+      <w:r>
+        <w:t>- Database query time: 85ms average</w:t>
+      </w:r>
+    </w:p>
+    <w:p>
+      <w:r>
+        <w:t>- System throughput: 2000+ requests/second</w:t>
+      </w:r>
+    </w:p>
+    <w:p>
+      <w:r>
+        <w:t>- Concurrent user support: 5000+</w:t>
+      </w:r>
+    </w:p>
+    <w:p>
+      <w:r>
+        <w:t>Lighthouse Scores:</w:t>
+      </w:r>
+    </w:p>
+    <w:p>
+      <w:r>
+        <w:t>- Performance: 92/100</w:t>
+      </w:r>
+    </w:p>
+    <w:p>
+      <w:r>
+        <w:t>- Accessibility: 98/100</w:t>
+      </w:r>
+    </w:p>
+    <w:p>
+      <w:r>
+        <w:t>- Best Practices: 95/100</w:t>
+      </w:r>
+    </w:p>
+    <w:p>
+      <w:r>
+        <w:t>- SEO: 96/100</w:t>
+      </w:r>
+    </w:p>
+    <w:p>
+      <w:r>
+        <w:t>8. Testing Framework</w:t>
+      </w:r>
+    </w:p>
+    <w:p>
+      <w:r>
+        <w:t>Unit Testing:</w:t>
+      </w:r>
+    </w:p>
+    <w:p>
+      <w:r>
+        <w:t>- Jest framework</w:t>
+      </w:r>
+    </w:p>
+    <w:p>
+      <w:r>
+        <w:t>- 450+ test cases</w:t>
+      </w:r>
+    </w:p>
+    <w:p>
+      <w:r>
+        <w:t>- 82% code coverage</w:t>
+      </w:r>
+    </w:p>
+    <w:p>
+      <w:r>
+        <w:t>- Average execution: 45 minutes</w:t>
+      </w:r>
+    </w:p>
+    <w:p>
+      <w:r>
+        <w:t>Integration Testing:</w:t>
+      </w:r>
+    </w:p>
+    <w:p>
+      <w:r>
+        <w:t>- Database integration tests</w:t>
+      </w:r>
+    </w:p>
+    <w:p>
+      <w:r>
+        <w:t>- API integration tests</w:t>
+      </w:r>
+    </w:p>
+    <w:p>
+      <w:r>
+        <w:t>- Service-to-service tests</w:t>
+      </w:r>
+    </w:p>
+    <w:p>
+      <w:r>
+        <w:t>- Message queue tests</w:t>
+      </w:r>
+    </w:p>
+    <w:p>
+      <w:r>
+        <w:t>Performance Testing:</w:t>
+      </w:r>
+    </w:p>
+    <w:p>
+      <w:r>
+        <w:t>- Load testing with 5000 concurrent users</w:t>
+      </w:r>
+    </w:p>
+    <w:p>
+      <w:r>
+        <w:t>- Stress testing to breaking point</w:t>
+      </w:r>
+    </w:p>
+    <w:p>
+      <w:r>
+        <w:t>- Endurance testing for 24 hours</w:t>
+      </w:r>
+    </w:p>
+    <w:p>
+      <w:r>
+        <w:t>- Spike testing with sudden load increases</w:t>
+      </w:r>
+    </w:p>
+    <w:p>
+      <w:r>
+        <w:t>Security Testing:</w:t>
+      </w:r>
+    </w:p>
+    <w:p>
+      <w:r>
+        <w:t>- OWASP Top 10 vulnerability scanning</w:t>
+      </w:r>
+    </w:p>
+    <w:p>
+      <w:r>
+        <w:t>- Penetration testing quarterly</w:t>
+      </w:r>
+    </w:p>
+    <w:p>
+      <w:r>
+        <w:t>- Code dependency scanning</w:t>
+      </w:r>
+    </w:p>
+    <w:p>
+      <w:r>
+        <w:t>- Secrets scanning</w:t>
+      </w:r>
+    </w:p>
+    <w:p>
+      <w:r>
+        <w:br w:type="page"/>
+      </w:r>
+    </w:p>
+    <w:p>
+      <w:r>
+        <w:t>APPENDIX B: IMPLEMENTATION DETAILS AND CODE STANDARDS</w:t>
+      </w:r>
+    </w:p>
+    <w:p>
+      <w:r>
+        <w:t>1. Code Structure</w:t>
+      </w:r>
+    </w:p>
+    <w:p>
+      <w:r>
+        <w:t>Project Layout:</w:t>
+      </w:r>
+    </w:p>
+    <w:p>
+      <w:r>
+        <w:t>/src</w:t>
+      </w:r>
+    </w:p>
+    <w:p>
+      <w:r>
+        <w:t xml:space="preserve">  /api</w:t>
+      </w:r>
+    </w:p>
+    <w:p>
+      <w:r>
+        <w:t xml:space="preserve">    /routes</w:t>
+      </w:r>
+    </w:p>
+    <w:p>
+      <w:r>
+        <w:t xml:space="preserve">      - auth.routes.js</w:t>
+      </w:r>
+    </w:p>
+    <w:p>
+      <w:r>
+        <w:t xml:space="preserve">      - events.routes.js</w:t>
+      </w:r>
+    </w:p>
+    <w:p>
+      <w:r>
+        <w:t xml:space="preserve">      - bookings.routes.js</w:t>
+      </w:r>
+    </w:p>
+    <w:p>
+      <w:r>
+        <w:t xml:space="preserve">      - payments.routes.js</w:t>
+      </w:r>
+    </w:p>
+    <w:p>
+      <w:r>
+        <w:t xml:space="preserve">    /controllers</w:t>
+      </w:r>
+    </w:p>
+    <w:p>
+      <w:r>
+        <w:t xml:space="preserve">    /services</w:t>
+      </w:r>
+    </w:p>
+    <w:p>
+      <w:r>
+        <w:t xml:space="preserve">    /models</w:t>
+      </w:r>
+    </w:p>
+    <w:p>
+      <w:r>
+        <w:t xml:space="preserve">    /middleware</w:t>
+      </w:r>
+    </w:p>
+    <w:p>
+      <w:r>
+        <w:t xml:space="preserve">  /frontend</w:t>
+      </w:r>
+    </w:p>
+    <w:p>
+      <w:r>
+        <w:t xml:space="preserve">    /components</w:t>
+      </w:r>
+    </w:p>
+    <w:p>
+      <w:r>
+        <w:t xml:space="preserve">    /pages</w:t>
+      </w:r>
+    </w:p>
+    <w:p>
+      <w:r>
+        <w:t xml:space="preserve">    /store (Redux)</w:t>
+      </w:r>
+    </w:p>
+    <w:p>
+      <w:r>
+        <w:t xml:space="preserve">    /hooks</w:t>
+      </w:r>
+    </w:p>
+    <w:p>
+      <w:r>
+        <w:t xml:space="preserve">    /styles</w:t>
+      </w:r>
+    </w:p>
+    <w:p>
+      <w:r>
+        <w:t xml:space="preserve">  /utils</w:t>
+      </w:r>
+    </w:p>
+    <w:p>
+      <w:r>
+        <w:t xml:space="preserve">  /constants</w:t>
+      </w:r>
+    </w:p>
+    <w:p>
+      <w:r>
+        <w:t xml:space="preserve">  /config</w:t>
+      </w:r>
+    </w:p>
+    <w:p>
+      <w:r>
+        <w:t>/tests</w:t>
+      </w:r>
+    </w:p>
+    <w:p>
+      <w:r>
+        <w:t xml:space="preserve">  /unit</w:t>
+      </w:r>
+    </w:p>
+    <w:p>
+      <w:r>
+        <w:t xml:space="preserve">  /integration</w:t>
+      </w:r>
+    </w:p>
+    <w:p>
+      <w:r>
+        <w:t xml:space="preserve">  /e2e</w:t>
+      </w:r>
+    </w:p>
+    <w:p>
+      <w:r>
+        <w:t>/docs</w:t>
+      </w:r>
+    </w:p>
+    <w:p>
+      <w:r>
+        <w:t xml:space="preserve">  /api</w:t>
+      </w:r>
+    </w:p>
+    <w:p>
+      <w:r>
+        <w:t xml:space="preserve">  /architecture</w:t>
+      </w:r>
+    </w:p>
+    <w:p>
+      <w:r>
+        <w:t>/docker</w:t>
+      </w:r>
+    </w:p>
+    <w:p>
+      <w:r>
+        <w:t xml:space="preserve">  - Dockerfile</w:t>
+      </w:r>
+    </w:p>
+    <w:p>
+      <w:r>
+        <w:t xml:space="preserve">  - docker-compose.yml</w:t>
+      </w:r>
+    </w:p>
+    <w:p>
+      <w:r>
+        <w:t>/k8s</w:t>
+      </w:r>
+    </w:p>
+    <w:p>
+      <w:r>
+        <w:t xml:space="preserve">  - deployment.yaml</w:t>
+      </w:r>
+    </w:p>
+    <w:p>
+      <w:r>
+        <w:t xml:space="preserve">  - service.yaml</w:t>
+      </w:r>
+    </w:p>
+    <w:p>
+      <w:r>
+        <w:t xml:space="preserve">  - configmap.yaml</w:t>
+      </w:r>
+    </w:p>
+    <w:p>
+      <w:r>
+        <w:t>2. Coding Standards</w:t>
+      </w:r>
+    </w:p>
+    <w:p>
+      <w:r>
+        <w:t>JavaScript Style:</w:t>
+      </w:r>
+    </w:p>
+    <w:p>
+      <w:r>
+        <w:t>- ES6+ features (arrow functions, destructuring, etc.)</w:t>
+      </w:r>
+    </w:p>
+    <w:p>
+      <w:r>
+        <w:t>- Naming: camelCase for variables, PascalCase for classes</w:t>
+      </w:r>
+    </w:p>
+    <w:p>
+      <w:r>
+        <w:t>- Maximum line length: 100 characters</w:t>
+      </w:r>
+    </w:p>
+    <w:p>
+      <w:r>
+        <w:t>- Use const by default, let if needed, avoid var</w:t>
+      </w:r>
+    </w:p>
+    <w:p>
+      <w:r>
+        <w:t>- Functions: Prefer named functions over anonymous</w:t>
+      </w:r>
+    </w:p>
+    <w:p>
+      <w:r>
+        <w:t>React Best Practices:</w:t>
+      </w:r>
+    </w:p>
+    <w:p>
+      <w:r>
+        <w:t>- Functional components with hooks</w:t>
+      </w:r>
+    </w:p>
+    <w:p>
+      <w:r>
+        <w:t>- Props validation with PropTypes</w:t>
+      </w:r>
+    </w:p>
+    <w:p>
+      <w:r>
+        <w:t>- Memoization for expensive components</w:t>
+      </w:r>
+    </w:p>
+    <w:p>
+      <w:r>
+        <w:t>- Error boundary implementation</w:t>
+      </w:r>
+    </w:p>
+    <w:p>
+      <w:r>
+        <w:t>- Key prop for list items</w:t>
+      </w:r>
+    </w:p>
+    <w:p>
+      <w:r>
+        <w:t>Comments:</w:t>
+      </w:r>
+    </w:p>
+    <w:p>
+      <w:r>
+        <w:t>- Comment complex business logic</w:t>
+      </w:r>
+    </w:p>
+    <w:p>
+      <w:r>
+        <w:t>- Avoid redundant comments</w:t>
+      </w:r>
+    </w:p>
+    <w:p>
+      <w:r>
+        <w:t>- Update comments with code changes</w:t>
+      </w:r>
+    </w:p>
+    <w:p>
+      <w:r>
+        <w:t>- Document non-obvious decisions</w:t>
+      </w:r>
+    </w:p>
+    <w:p>
+      <w:r>
+        <w:t>3. Version Control</w:t>
+      </w:r>
+    </w:p>
+    <w:p>
+      <w:r>
+        <w:t>Git Workflow:</w:t>
+      </w:r>
+    </w:p>
+    <w:p>
+      <w:r>
+        <w:t>- Main branch: Production code only</w:t>
+      </w:r>
+    </w:p>
+    <w:p>
+      <w:r>
+        <w:t>- Develop branch: Integration branch</w:t>
+      </w:r>
+    </w:p>
+    <w:p>
+      <w:r>
+        <w:t>- Feature branches: feature/description</w:t>
+      </w:r>
+    </w:p>
+    <w:p>
+      <w:r>
+        <w:t>- Bugfix branches: bugfix/description</w:t>
+      </w:r>
+    </w:p>
+    <w:p>
+      <w:r>
+        <w:t>- Release branches: release/version</w:t>
+      </w:r>
+    </w:p>
+    <w:p>
+      <w:r>
+        <w:t>Commit Messages:</w:t>
+      </w:r>
+    </w:p>
+    <w:p>
+      <w:r>
+        <w:t>- Format: type(scope): description</w:t>
+      </w:r>
+    </w:p>
+    <w:p>
+      <w:r>
+        <w:t>- Types: feat, fix, docs, style, refactor, test, chore</w:t>
+      </w:r>
+    </w:p>
+    <w:p>
+      <w:r>
+        <w:t>- Example: feat(auth): add two-factor authentication</w:t>
+      </w:r>
+    </w:p>
+    <w:p>
+      <w:r>
+        <w:t>- Keep messages under 50 characters</w:t>
+      </w:r>
+    </w:p>
+    <w:p>
+      <w:r>
+        <w:t>- Reference issue numbers: fixes #123</w:t>
+      </w:r>
+    </w:p>
+    <w:p>
+      <w:r>
+        <w:t>Pull Requests:</w:t>
+      </w:r>
+    </w:p>
+    <w:p>
+      <w:r>
+        <w:t>- Clear title describing change</w:t>
+      </w:r>
+    </w:p>
+    <w:p>
+      <w:r>
+        <w:t>- Detailed description of changes</w:t>
+      </w:r>
+    </w:p>
+    <w:p>
+      <w:r>
+        <w:t>- Link to issue tickets</w:t>
+      </w:r>
+    </w:p>
+    <w:p>
+      <w:r>
+        <w:t>- Screenshots for UI changes</w:t>
+      </w:r>
+    </w:p>
+    <w:p>
+      <w:r>
+        <w:t>- Minimum 2 approvals required</w:t>
+      </w:r>
+    </w:p>
+    <w:p>
+      <w:r>
+        <w:t>4. Dependency Management</w:t>
+      </w:r>
+    </w:p>
+    <w:p>
+      <w:r>
+        <w:t>Package Updates:</w:t>
+      </w:r>
+    </w:p>
+    <w:p>
+      <w:r>
+        <w:t>- Weekly security scan</w:t>
+      </w:r>
+    </w:p>
+    <w:p>
+      <w:r>
+        <w:t>- Monthly dependency updates</w:t>
+      </w:r>
+    </w:p>
+    <w:p>
+      <w:r>
+        <w:t>- Review breaking changes</w:t>
+      </w:r>
+    </w:p>
+    <w:p>
+      <w:r>
+        <w:t>- Test thoroughly after updates</w:t>
+      </w:r>
+    </w:p>
+    <w:p>
+      <w:r>
+        <w:t>- Keep lock files in version control</w:t>
+      </w:r>
+    </w:p>
+    <w:p>
+      <w:r>
+        <w:t>Critical Dependencies:</w:t>
+      </w:r>
+    </w:p>
+    <w:p>
+      <w:r>
+        <w:t>- React 18.x (UI framework)</w:t>
+      </w:r>
+    </w:p>
+    <w:p>
+      <w:r>
+        <w:t>- Express 4.x (web server)</w:t>
+      </w:r>
+    </w:p>
+    <w:p>
+      <w:r>
+        <w:t>- MongoDB driver (database)</w:t>
+      </w:r>
+    </w:p>
+    <w:p>
+      <w:r>
+        <w:t>- JWT (authentication)</w:t>
+      </w:r>
+    </w:p>
+    <w:p>
+      <w:r>
+        <w:t>- Stripe SDK (payments)</w:t>
+      </w:r>
+    </w:p>
+    <w:p>
+      <w:r>
+        <w:t>Development Dependencies:</w:t>
+      </w:r>
+    </w:p>
+    <w:p>
+      <w:r>
+        <w:t>- Jest (testing)</w:t>
+      </w:r>
+    </w:p>
+    <w:p>
+      <w:r>
+        <w:t>- ESLint (linting)</w:t>
+      </w:r>
+    </w:p>
+    <w:p>
+      <w:r>
+        <w:t>- Prettier (formatting)</w:t>
+      </w:r>
+    </w:p>
+    <w:p>
+      <w:r>
+        <w:t>- Webpack (bundling)</w:t>
+      </w:r>
+    </w:p>
+    <w:p>
+      <w:r>
+        <w:t>5. Deployment Pipeline</w:t>
+      </w:r>
+    </w:p>
+    <w:p>
+      <w:r>
+        <w:t>CI/CD Stages:</w:t>
+      </w:r>
+    </w:p>
+    <w:p>
+      <w:r>
+        <w:t>1. Code commit to GitHub</w:t>
+      </w:r>
+    </w:p>
+    <w:p>
+      <w:r>
+        <w:t>2. GitHub Actions triggers workflow</w:t>
+      </w:r>
+    </w:p>
+    <w:p>
+      <w:r>
+        <w:t>3. Install dependencies</w:t>
+      </w:r>
+    </w:p>
+    <w:p>
+      <w:r>
+        <w:t>4. Run linters (ESLint)</w:t>
+      </w:r>
+    </w:p>
+    <w:p>
+      <w:r>
+        <w:t>5. Run tests (Jest)</w:t>
+      </w:r>
+    </w:p>
+    <w:p>
+      <w:r>
+        <w:t>6. Build Docker image</w:t>
+      </w:r>
+    </w:p>
+    <w:p>
+      <w:r>
+        <w:t>7. Push to container registry</w:t>
+      </w:r>
+    </w:p>
+    <w:p>
+      <w:r>
+        <w:t>8. Update Kubernetes manifests</w:t>
+      </w:r>
+    </w:p>
+    <w:p>
+      <w:r>
+        <w:t>9. Deploy to staging</w:t>
+      </w:r>
+    </w:p>
+    <w:p>
+      <w:r>
+        <w:t>10. Run smoke tests</w:t>
+      </w:r>
+    </w:p>
+    <w:p>
+      <w:r>
+        <w:t>11. Deploy to production</w:t>
+      </w:r>
+    </w:p>
+    <w:p>
+      <w:r>
+        <w:t>12. Verify deployment</w:t>
+      </w:r>
+    </w:p>
+    <w:p>
+      <w:r>
+        <w:t>6. Release Process</w:t>
+      </w:r>
+    </w:p>
+    <w:p>
+      <w:r>
+        <w:t>Release Schedule:</w:t>
+      </w:r>
+    </w:p>
+    <w:p>
+      <w:r>
+        <w:t>- Feature releases: Monthly (first Tuesday)</w:t>
+      </w:r>
+    </w:p>
+    <w:p>
+      <w:r>
+        <w:t>- Patch releases: As needed for critical bugs</w:t>
+      </w:r>
+    </w:p>
+    <w:p>
+      <w:r>
+        <w:t>- Security releases: Within 24 hours</w:t>
+      </w:r>
+    </w:p>
+    <w:p>
+      <w:r>
+        <w:t>Version Numbering:</w:t>
+      </w:r>
+    </w:p>
+    <w:p>
+      <w:r>
+        <w:t>- MAJOR: Breaking changes</w:t>
+      </w:r>
+    </w:p>
+    <w:p>
+      <w:r>
+        <w:t>- MINOR: New features (backwards compatible)</w:t>
+      </w:r>
+    </w:p>
+    <w:p>
+      <w:r>
+        <w:t>- PATCH: Bug fixes</w:t>
+      </w:r>
+    </w:p>
+    <w:p>
+      <w:r>
+        <w:t>Release Steps:</w:t>
+      </w:r>
+    </w:p>
+    <w:p>
+      <w:r>
+        <w:t>1. Create release branch</w:t>
+      </w:r>
+    </w:p>
+    <w:p>
+      <w:r>
+        <w:t>2. Update version numbers</w:t>
+      </w:r>
+    </w:p>
+    <w:p>
+      <w:r>
+        <w:t>3. Update CHANGELOG</w:t>
+      </w:r>
+    </w:p>
+    <w:p>
+      <w:r>
+        <w:t>4. Create release PR</w:t>
+      </w:r>
+    </w:p>
+    <w:p>
+      <w:r>
+        <w:t>5. Merge after approval</w:t>
+      </w:r>
+    </w:p>
+    <w:p>
+      <w:r>
+        <w:t>6. Tag commit with version</w:t>
+      </w:r>
+    </w:p>
+    <w:p>
+      <w:r>
+        <w:t>7. Build and deploy</w:t>
+      </w:r>
+    </w:p>
+    <w:p>
+      <w:r>
+        <w:t>8. Create GitHub release notes</w:t>
+      </w:r>
+    </w:p>
+    <w:p>
+      <w:r>
+        <w:t>9. Announce to stakeholders</w:t>
+      </w:r>
+    </w:p>
+    <w:p>
+      <w:r>
+        <w:t>7. Documentation Requirements</w:t>
+      </w:r>
+    </w:p>
+    <w:p>
+      <w:r>
+        <w:t>Code Documentation:</w:t>
+      </w:r>
+    </w:p>
+    <w:p>
+      <w:r>
+        <w:t>- JSDoc comments for functions</w:t>
+      </w:r>
+    </w:p>
+    <w:p>
+      <w:r>
+        <w:t>- README for each module</w:t>
+      </w:r>
+    </w:p>
+    <w:p>
+      <w:r>
+        <w:t>- Architecture Decision Records (ADRs)</w:t>
+      </w:r>
+    </w:p>
+    <w:p>
+      <w:r>
+        <w:t>- API endpoint examples</w:t>
+      </w:r>
+    </w:p>
+    <w:p>
+      <w:r>
+        <w:t>- Database schema diagrams</w:t>
+      </w:r>
+    </w:p>
+    <w:p>
+      <w:r>
+        <w:t>Developer Guide:</w:t>
+      </w:r>
+    </w:p>
+    <w:p>
+      <w:r>
+        <w:t>- Setup instructions</w:t>
+      </w:r>
+    </w:p>
+    <w:p>
+      <w:r>
+        <w:t>- Running tests</w:t>
+      </w:r>
+    </w:p>
+    <w:p>
+      <w:r>
+        <w:t>- Building locally</w:t>
+      </w:r>
+    </w:p>
+    <w:p>
+      <w:r>
+        <w:t>- Deployment procedures</w:t>
+      </w:r>
+    </w:p>
+    <w:p>
+      <w:r>
+        <w:t>- Troubleshooting guide</w:t>
+      </w:r>
+    </w:p>
+    <w:p>
+      <w:r>
+        <w:t>User Documentation:</w:t>
+      </w:r>
+    </w:p>
+    <w:p>
+      <w:r>
+        <w:t>- Feature guides</w:t>
+      </w:r>
+    </w:p>
+    <w:p>
+      <w:r>
+        <w:t>- FAQs</w:t>
+      </w:r>
+    </w:p>
+    <w:p>
+      <w:r>
+        <w:t>- Video tutorials</w:t>
+      </w:r>
+    </w:p>
+    <w:p>
+      <w:r>
+        <w:t>- API documentation</w:t>
+      </w:r>
+    </w:p>
+    <w:p>
+      <w:r>
+        <w:t>- Glossary</w:t>
+      </w:r>
+    </w:p>
+    <w:p>
+      <w:r>
+        <w:t>8. Quality Metrics</w:t>
+      </w:r>
+    </w:p>
+    <w:p>
+      <w:r>
+        <w:t>Code Quality Targets:</w:t>
+      </w:r>
+    </w:p>
+    <w:p>
+      <w:r>
+        <w:t>- Coverage: &gt; 80% for critical paths</w:t>
+      </w:r>
+    </w:p>
+    <w:p>
+      <w:r>
+        <w:t>- Cyclomatic complexity: &lt; 10</w:t>
+      </w:r>
+    </w:p>
+    <w:p>
+      <w:r>
+        <w:t>- Code duplication: &lt; 5%</w:t>
+      </w:r>
+    </w:p>
+    <w:p>
+      <w:r>
+        <w:t>- Technical debt: &lt; 5 days</w:t>
+      </w:r>
+    </w:p>
+    <w:p>
+      <w:r>
+        <w:t>Performance Targets:</w:t>
+      </w:r>
+    </w:p>
+    <w:p>
+      <w:r>
+        <w:t>- API response: &lt; 200ms P95</w:t>
+      </w:r>
+    </w:p>
+    <w:p>
+      <w:r>
+        <w:t>- Page load: &lt; 2 seconds</w:t>
+      </w:r>
+    </w:p>
+    <w:p>
+      <w:r>
+        <w:t>- Lighthouse: &gt; 90</w:t>
+      </w:r>
+    </w:p>
+    <w:p>
+      <w:r>
+        <w:t>- Core Web Vitals: All "Good"</w:t>
+      </w:r>
+    </w:p>
+    <w:p>
+      <w:r>
+        <w:t>Reliability Targets:</w:t>
+      </w:r>
+    </w:p>
+    <w:p>
+      <w:r>
+        <w:t>- Uptime: 99.95% SLA</w:t>
+      </w:r>
+    </w:p>
+    <w:p>
+      <w:r>
+        <w:t>- Mean time to recovery: &lt; 1 hour</w:t>
+      </w:r>
+    </w:p>
+    <w:p>
+      <w:r>
+        <w:t>- Change failure rate: &lt; 1%</w:t>
+      </w:r>
+    </w:p>
+    <w:p>
+      <w:r>
+        <w:t>- Bug escape rate: &lt; 1%</w:t>
       </w:r>
     </w:p>
     <w:sectPr>
@@ -17763,6 +20828,23 @@
     </w:p>
   </w:endnote>
 </w:endnotes>
+</file>
+
+<file path=word/footer1.xml><?xml version="1.0" encoding="utf-8"?>
+<w:ftr xmlns:m="http://schemas.openxmlformats.org/officeDocument/2006/math" xmlns:mc="http://schemas.openxmlformats.org/markup-compatibility/2006" xmlns:mo="http://schemas.microsoft.com/office/mac/office/2008/main" xmlns:mv="urn:schemas-microsoft-com:mac:vml" xmlns:o="urn:schemas-microsoft-com:office:office" xmlns:r="http://schemas.openxmlformats.org/officeDocument/2006/relationships" xmlns:v="urn:schemas-microsoft-com:vml" xmlns:w10="urn:schemas-microsoft-com:office:word" xmlns:w14="http://schemas.microsoft.com/office/word/2010/wordml" xmlns:w="http://schemas.openxmlformats.org/wordprocessingml/2006/main" xmlns:wne="http://schemas.microsoft.com/office/word/2006/wordml" xmlns:wp14="http://schemas.microsoft.com/office/word/2010/wordprocessingDrawing" xmlns:wp="http://schemas.openxmlformats.org/drawingml/2006/wordprocessingDrawing" xmlns:wpc="http://schemas.microsoft.com/office/word/2010/wordprocessingCanvas" xmlns:wpg="http://schemas.microsoft.com/office/word/2010/wordprocessingGroup" xmlns:wpi="http://schemas.microsoft.com/office/word/2010/wordprocessingInk" xmlns:wps="http://schemas.microsoft.com/office/word/2010/wordprocessingShape" mc:Ignorable="w14 wp14">
+  <w:p>
+    <w:pPr>
+      <w:pStyle w:val="Footer"/>
+      <w:jc w:val="center"/>
+    </w:pPr>
+    <w:r/>
+    <w:r>
+      <w:fldChar w:fldCharType="begin"/>
+      <w:instrText xml:space="preserve">PAGE</w:instrText>
+      <w:fldChar w:fldCharType="end"/>
+    </w:r>
+  </w:p>
+</w:ftr>
 </file>
 
 <file path=word/footnotes.xml><?xml version="1.0" encoding="utf-8"?>

</xml_diff>